<commit_message>
replication code for jeh
</commit_message>
<xml_diff>
--- a/drafts/202512_jeh_final_submission/marriage_bars_main.docx
+++ b/drafts/202512_jeh_final_submission/marriage_bars_main.docx
@@ -1171,9 +1171,23 @@
           <w:rFonts w:ascii="Times New Roman" w:hAnsi="Times New Roman" w:cs="Times New Roman"/>
         </w:rPr>
         <w:lastRenderedPageBreak/>
-        <w:t>unmarried women from later becoming teachers. Instead, we find evidence that the laws led to unmarried women who were already teachers to switch into other occupations, without affecting their earnings as proxied by occupational scores. In addition, we show that the laws increased overall LFP among unmarried women who were already teachers, where the increase was entirely driven by those who became married and remained in the labor force. We therefore conclude that the policy change had a net positive impact on women’s labor market outcomes, pulling women into the labor force without pushing incumbent women teachers out of the labor force or to lower paying jobs.</w:t>
-      </w:r>
-      <w:del w:id="21" w:author="Amy Kim" w:date="2025-12-11T14:57:00Z">
+        <w:t>unmarried women from later becoming teachers. Instead, we find evidence that the laws led</w:t>
+      </w:r>
+      <w:del w:id="21" w:author="Amy Kim" w:date="2025-12-11T17:26:00Z">
+        <w:r>
+          <w:rPr>
+            <w:rFonts w:ascii="Times New Roman" w:hAnsi="Times New Roman" w:cs="Times New Roman"/>
+          </w:rPr>
+          <w:delText xml:space="preserve"> to</w:delText>
+        </w:r>
+      </w:del>
+      <w:r>
+        <w:rPr>
+          <w:rFonts w:ascii="Times New Roman" w:hAnsi="Times New Roman" w:cs="Times New Roman"/>
+        </w:rPr>
+        <w:t xml:space="preserve"> unmarried women who were already teachers to switch into other occupations, without affecting their earnings as proxied by occupational scores. In addition, we show that the laws increased overall LFP among unmarried women who were already teachers, where the increase was entirely driven by those who became married and remained in the labor force. We therefore conclude that the policy change had a net positive impact on women’s labor market outcomes, pulling women into the labor force without pushing incumbent women teachers out of the labor force or to lower paying jobs.</w:t>
+      </w:r>
+      <w:del w:id="22" w:author="Amy Kim" w:date="2025-12-11T14:57:00Z">
         <w:r>
           <w:rPr>
             <w:rFonts w:ascii="Times New Roman" w:hAnsi="Times New Roman" w:cs="Times New Roman"/>
@@ -1198,7 +1212,7 @@
         </w:rPr>
         <w:t>Overall, our study shows that removing institutional barriers to employment specific to married women modestly improved white women’s labor market outcomes between 1930 and 1950</w:t>
       </w:r>
-      <w:ins w:id="24" w:author="Amy Kim" w:date="2025-12-11T14:52:00Z">
+      <w:ins w:id="25" w:author="Amy Kim" w:date="2025-12-11T14:52:00Z">
         <w:r>
           <w:rPr>
             <w:rFonts w:ascii="Times New Roman" w:hAnsi="Times New Roman" w:cs="Times New Roman"/>
@@ -1206,7 +1220,7 @@
           <w:t xml:space="preserve"> in the</w:t>
         </w:r>
       </w:ins>
-      <w:ins w:id="25" w:author="Amy Kim" w:date="2025-12-11T14:53:00Z">
+      <w:ins w:id="26" w:author="Amy Kim" w:date="2025-12-11T14:53:00Z">
         <w:r>
           <w:rPr>
             <w:rFonts w:ascii="Times New Roman" w:hAnsi="Times New Roman" w:cs="Times New Roman"/>
@@ -1220,7 +1234,7 @@
         </w:rPr>
         <w:t xml:space="preserve">. Our findings also serve as a cautionary tale: in the presence of gendered social attitudes, the costs of such policies may be borne by other women who are reshuffled to other occupations. </w:t>
       </w:r>
-      <w:ins w:id="26" w:author="Amy Kim" w:date="2025-12-11T14:54:00Z">
+      <w:ins w:id="27" w:author="Amy Kim" w:date="2025-12-11T14:54:00Z">
         <w:r>
           <w:rPr>
             <w:rFonts w:ascii="Times New Roman" w:hAnsi="Times New Roman" w:cs="Times New Roman"/>
@@ -1228,7 +1242,7 @@
           <w:t>In our setting, whi</w:t>
         </w:r>
       </w:ins>
-      <w:ins w:id="27" w:author="Amy Kim" w:date="2025-12-11T14:55:00Z">
+      <w:ins w:id="28" w:author="Amy Kim" w:date="2025-12-11T14:55:00Z">
         <w:r>
           <w:rPr>
             <w:rFonts w:ascii="Times New Roman" w:hAnsi="Times New Roman" w:cs="Times New Roman"/>
@@ -1236,7 +1250,7 @@
           <w:t xml:space="preserve">le we </w:t>
         </w:r>
       </w:ins>
-      <w:ins w:id="28" w:author="Amy Kim" w:date="2025-12-11T14:57:00Z">
+      <w:ins w:id="29" w:author="Amy Kim" w:date="2025-12-11T14:57:00Z">
         <w:r>
           <w:rPr>
             <w:rFonts w:ascii="Times New Roman" w:hAnsi="Times New Roman" w:cs="Times New Roman"/>
@@ -1244,7 +1258,7 @@
           <w:t>show that prohibiting m</w:t>
         </w:r>
       </w:ins>
-      <w:ins w:id="29" w:author="Amy Kim" w:date="2025-12-11T14:58:00Z">
+      <w:ins w:id="30" w:author="Amy Kim" w:date="2025-12-11T14:58:00Z">
         <w:r>
           <w:rPr>
             <w:rFonts w:ascii="Times New Roman" w:hAnsi="Times New Roman" w:cs="Times New Roman"/>
@@ -1252,7 +1266,7 @@
           <w:t>arriage bars increased the labor force participation of incumbent teachers</w:t>
         </w:r>
       </w:ins>
-      <w:ins w:id="30" w:author="Amy Kim" w:date="2025-12-11T14:55:00Z">
+      <w:ins w:id="31" w:author="Amy Kim" w:date="2025-12-11T14:55:00Z">
         <w:r>
           <w:rPr>
             <w:rFonts w:ascii="Times New Roman" w:hAnsi="Times New Roman" w:cs="Times New Roman"/>
@@ -1274,7 +1288,7 @@
           <w:t xml:space="preserve">decreasing the labor force participation of </w:t>
         </w:r>
       </w:ins>
-      <w:ins w:id="31" w:author="Amy Kim" w:date="2025-12-11T14:56:00Z">
+      <w:ins w:id="32" w:author="Amy Kim" w:date="2025-12-11T14:56:00Z">
         <w:r>
           <w:rPr>
             <w:rFonts w:ascii="Times New Roman" w:hAnsi="Times New Roman" w:cs="Times New Roman"/>
@@ -1282,7 +1296,7 @@
           <w:t xml:space="preserve">potential future teachers, because teachers comprised only a small share of the population, we are unable to detect an effect of the prohibitions on all women’s LFP. </w:t>
         </w:r>
       </w:ins>
-      <w:del w:id="32" w:author="Amy Kim" w:date="2025-12-11T14:59:00Z">
+      <w:del w:id="33" w:author="Amy Kim" w:date="2025-12-11T14:59:00Z">
         <w:r>
           <w:rPr>
             <w:rFonts w:ascii="Times New Roman" w:hAnsi="Times New Roman" w:cs="Times New Roman"/>
@@ -2096,7 +2110,21 @@
         <w:rPr>
           <w:rFonts w:ascii="Times New Roman" w:hAnsi="Times New Roman" w:cs="Times New Roman"/>
         </w:rPr>
-        <w:t>). As such, marriage bar use in the US quickly declined and largely ended by the 1950s and 1960s.</w:t>
+        <w:t xml:space="preserve">). As such, marriage bar </w:t>
+      </w:r>
+      <w:proofErr w:type="gramStart"/>
+      <w:r>
+        <w:rPr>
+          <w:rFonts w:ascii="Times New Roman" w:hAnsi="Times New Roman" w:cs="Times New Roman"/>
+        </w:rPr>
+        <w:t>use</w:t>
+      </w:r>
+      <w:proofErr w:type="gramEnd"/>
+      <w:r>
+        <w:rPr>
+          <w:rFonts w:ascii="Times New Roman" w:hAnsi="Times New Roman" w:cs="Times New Roman"/>
+        </w:rPr>
+        <w:t xml:space="preserve"> in the US quickly declined and largely ended by the 1950s and 1960s.</w:t>
       </w:r>
       <w:r>
         <w:rPr>
@@ -2177,7 +2205,7 @@
         </w:rPr>
         <w:t>dominated occupation and one of the few socially-accepted occupations for educated women at the time: in 1940, 31% of married women in the workforce with any college were teachers</w:t>
       </w:r>
-      <w:ins w:id="33" w:author="Amy Kim" w:date="2025-12-11T16:02:00Z">
+      <w:ins w:id="34" w:author="Amy Kim" w:date="2025-12-11T16:02:00Z">
         <w:r>
           <w:rPr>
             <w:rFonts w:ascii="Times New Roman" w:hAnsi="Times New Roman" w:cs="Times New Roman"/>
@@ -2185,7 +2213,7 @@
           <w:t xml:space="preserve"> (</w:t>
         </w:r>
       </w:ins>
-      <w:ins w:id="34" w:author="Amy Kim" w:date="2025-12-11T16:03:00Z">
+      <w:ins w:id="35" w:author="Amy Kim" w:date="2025-12-11T16:03:00Z">
         <w:r>
           <w:rPr>
             <w:rFonts w:ascii="Times New Roman" w:hAnsi="Times New Roman" w:cs="Times New Roman"/>
@@ -2219,7 +2247,7 @@
           <w:t>).</w:t>
         </w:r>
       </w:ins>
-      <w:del w:id="35" w:author="Amy Kim" w:date="2025-12-11T16:03:00Z">
+      <w:del w:id="36" w:author="Amy Kim" w:date="2025-12-11T16:03:00Z">
         <w:r>
           <w:rPr>
             <w:rFonts w:ascii="Times New Roman" w:hAnsi="Times New Roman" w:cs="Times New Roman"/>
@@ -2630,6 +2658,7 @@
         <w:spacing w:line="420" w:lineRule="auto"/>
         <w:ind w:left="0" w:firstLine="0"/>
         <w:rPr>
+          <w:ins w:id="37" w:author="Tsao, Carolyn (ELC)" w:date="2025-12-11T20:32:00Z"/>
           <w:rFonts w:ascii="Times New Roman" w:hAnsi="Times New Roman" w:cs="Times New Roman"/>
         </w:rPr>
       </w:pPr>
@@ -2774,20 +2803,550 @@
         <w:rPr>
           <w:rFonts w:ascii="Times New Roman" w:hAnsi="Times New Roman" w:cs="Times New Roman"/>
         </w:rPr>
-        <w:t xml:space="preserve">). To retain as many observations as possible, we only link between adjacent Censuses. We also drop the few linkages for which the sex or race is different between Censuses, or for which the implied year of birth varies by more than five years. Linkage rates are provided in Online Appendix </w:t>
-      </w:r>
-      <w:r>
-        <w:rPr>
-          <w:rFonts w:ascii="Times New Roman" w:hAnsi="Times New Roman" w:cs="Times New Roman"/>
-        </w:rPr>
-        <w:t>Table B1</w:t>
-      </w:r>
-      <w:r>
-        <w:rPr>
-          <w:rFonts w:ascii="Times New Roman" w:hAnsi="Times New Roman" w:cs="Times New Roman"/>
-        </w:rPr>
-        <w:t>.</w:t>
-      </w:r>
+        <w:t xml:space="preserve">). To retain as many observations as possible, we only link between adjacent Censuses. We also drop the few linkages for which the sex or race is different between Censuses, or for which the implied year of birth varies by more than five years. </w:t>
+      </w:r>
+    </w:p>
+    <w:p>
+      <w:pPr>
+        <w:spacing w:line="420" w:lineRule="auto"/>
+        <w:ind w:left="0" w:firstLine="720"/>
+        <w:rPr>
+          <w:ins w:id="38" w:author="Tsao, Carolyn (ELC)" w:date="2025-12-11T20:44:00Z"/>
+          <w:rFonts w:ascii="Times New Roman" w:hAnsi="Times New Roman" w:cs="Times New Roman"/>
+        </w:rPr>
+      </w:pPr>
+      <w:del w:id="39" w:author="Tsao, Carolyn (ELC)" w:date="2025-12-11T20:42:00Z">
+        <w:r>
+          <w:rPr>
+            <w:rFonts w:ascii="Times New Roman" w:hAnsi="Times New Roman" w:cs="Times New Roman"/>
+          </w:rPr>
+          <w:lastRenderedPageBreak/>
+          <w:delText xml:space="preserve">Linkage rates are provided in Online Appendix </w:delText>
+        </w:r>
+        <w:r>
+          <w:rPr>
+            <w:rFonts w:ascii="Times New Roman" w:hAnsi="Times New Roman" w:cs="Times New Roman"/>
+          </w:rPr>
+          <w:delText>Table B1</w:delText>
+        </w:r>
+        <w:r>
+          <w:rPr>
+            <w:rFonts w:ascii="Times New Roman" w:hAnsi="Times New Roman" w:cs="Times New Roman"/>
+          </w:rPr>
+          <w:delText>.</w:delText>
+        </w:r>
+      </w:del>
+      <w:ins w:id="40" w:author="Tsao, Carolyn (ELC)" w:date="2025-12-11T21:02:00Z">
+        <w:r>
+          <w:rPr>
+            <w:rFonts w:ascii="Times New Roman" w:hAnsi="Times New Roman" w:cs="Times New Roman"/>
+          </w:rPr>
+          <w:t xml:space="preserve">Reassuringly, we </w:t>
+        </w:r>
+      </w:ins>
+      <w:ins w:id="41" w:author="Tsao, Carolyn (ELC)" w:date="2025-12-11T20:40:00Z">
+        <w:r>
+          <w:rPr>
+            <w:rFonts w:ascii="Times New Roman" w:hAnsi="Times New Roman" w:cs="Times New Roman"/>
+          </w:rPr>
+          <w:t xml:space="preserve">find similar </w:t>
+        </w:r>
+      </w:ins>
+      <w:ins w:id="42" w:author="Tsao, Carolyn (ELC)" w:date="2025-12-11T20:38:00Z">
+        <w:r>
+          <w:rPr>
+            <w:rFonts w:ascii="Times New Roman" w:hAnsi="Times New Roman" w:cs="Times New Roman"/>
+          </w:rPr>
+          <w:t>linkage rates</w:t>
+        </w:r>
+      </w:ins>
+      <w:ins w:id="43" w:author="Tsao, Carolyn (ELC)" w:date="2025-12-11T20:40:00Z">
+        <w:r>
+          <w:rPr>
+            <w:rFonts w:ascii="Times New Roman" w:hAnsi="Times New Roman" w:cs="Times New Roman"/>
+          </w:rPr>
+          <w:t xml:space="preserve"> </w:t>
+        </w:r>
+      </w:ins>
+      <w:ins w:id="44" w:author="Tsao, Carolyn (ELC)" w:date="2025-12-11T20:38:00Z">
+        <w:r>
+          <w:rPr>
+            <w:rFonts w:ascii="Times New Roman" w:hAnsi="Times New Roman" w:cs="Times New Roman"/>
+          </w:rPr>
+          <w:t>between treated</w:t>
+        </w:r>
+      </w:ins>
+      <w:ins w:id="45" w:author="Tsao, Carolyn (ELC)" w:date="2025-12-11T20:37:00Z">
+        <w:r>
+          <w:rPr>
+            <w:rFonts w:ascii="Times New Roman" w:hAnsi="Times New Roman" w:cs="Times New Roman"/>
+          </w:rPr>
+          <w:t xml:space="preserve"> and control states</w:t>
+        </w:r>
+      </w:ins>
+      <w:ins w:id="46" w:author="Tsao, Carolyn (ELC)" w:date="2025-12-11T20:49:00Z">
+        <w:r>
+          <w:rPr>
+            <w:rFonts w:ascii="Times New Roman" w:hAnsi="Times New Roman" w:cs="Times New Roman"/>
+          </w:rPr>
+          <w:t xml:space="preserve"> over time</w:t>
+        </w:r>
+      </w:ins>
+      <w:ins w:id="47" w:author="Tsao, Carolyn (ELC)" w:date="2025-12-11T20:45:00Z">
+        <w:r>
+          <w:rPr>
+            <w:rFonts w:ascii="Times New Roman" w:hAnsi="Times New Roman" w:cs="Times New Roman"/>
+          </w:rPr>
+          <w:t>.</w:t>
+        </w:r>
+      </w:ins>
+      <w:ins w:id="48" w:author="Tsao, Carolyn (ELC)" w:date="2025-12-11T20:46:00Z">
+        <w:r>
+          <w:rPr>
+            <w:rStyle w:val="FootnoteReference"/>
+            <w:rFonts w:ascii="Times New Roman" w:hAnsi="Times New Roman" w:cs="Times New Roman"/>
+          </w:rPr>
+          <w:t xml:space="preserve"> </w:t>
+        </w:r>
+        <w:r>
+          <w:rPr>
+            <w:rStyle w:val="FootnoteReference"/>
+            <w:rFonts w:ascii="Times New Roman" w:hAnsi="Times New Roman" w:cs="Times New Roman"/>
+          </w:rPr>
+          <w:footnoteReference w:id="12"/>
+        </w:r>
+      </w:ins>
+      <w:ins w:id="53" w:author="Tsao, Carolyn (ELC)" w:date="2025-12-11T20:45:00Z">
+        <w:r>
+          <w:rPr>
+            <w:rFonts w:ascii="Times New Roman" w:hAnsi="Times New Roman" w:cs="Times New Roman"/>
+          </w:rPr>
+          <w:t xml:space="preserve"> However,</w:t>
+        </w:r>
+      </w:ins>
+      <w:ins w:id="54" w:author="Tsao, Carolyn (ELC)" w:date="2025-12-11T20:38:00Z">
+        <w:r>
+          <w:rPr>
+            <w:rFonts w:ascii="Times New Roman" w:hAnsi="Times New Roman" w:cs="Times New Roman"/>
+          </w:rPr>
+          <w:t xml:space="preserve"> </w:t>
+        </w:r>
+      </w:ins>
+      <w:ins w:id="55" w:author="Tsao, Carolyn (ELC)" w:date="2025-12-11T20:46:00Z">
+        <w:r>
+          <w:rPr>
+            <w:rFonts w:ascii="Times New Roman" w:hAnsi="Times New Roman" w:cs="Times New Roman"/>
+          </w:rPr>
+          <w:t xml:space="preserve">linkage loss </w:t>
+        </w:r>
+      </w:ins>
+      <w:ins w:id="56" w:author="Tsao, Carolyn (ELC)" w:date="2025-12-11T20:38:00Z">
+        <w:r>
+          <w:rPr>
+            <w:rFonts w:ascii="Times New Roman" w:hAnsi="Times New Roman" w:cs="Times New Roman"/>
+          </w:rPr>
+          <w:t xml:space="preserve">could </w:t>
+        </w:r>
+      </w:ins>
+      <w:ins w:id="57" w:author="Tsao, Carolyn (ELC)" w:date="2025-12-11T21:02:00Z">
+        <w:r>
+          <w:rPr>
+            <w:rFonts w:ascii="Times New Roman" w:hAnsi="Times New Roman" w:cs="Times New Roman"/>
+          </w:rPr>
+          <w:t xml:space="preserve">still </w:t>
+        </w:r>
+      </w:ins>
+      <w:ins w:id="58" w:author="Tsao, Carolyn (ELC)" w:date="2025-12-11T20:38:00Z">
+        <w:r>
+          <w:rPr>
+            <w:rFonts w:ascii="Times New Roman" w:hAnsi="Times New Roman" w:cs="Times New Roman"/>
+          </w:rPr>
+          <w:t xml:space="preserve">introduce bias </w:t>
+        </w:r>
+      </w:ins>
+      <w:ins w:id="59" w:author="Tsao, Carolyn (ELC)" w:date="2025-12-11T20:39:00Z">
+        <w:r>
+          <w:rPr>
+            <w:rFonts w:ascii="Times New Roman" w:hAnsi="Times New Roman" w:cs="Times New Roman"/>
+          </w:rPr>
+          <w:t xml:space="preserve">to our results. </w:t>
+        </w:r>
+      </w:ins>
+      <w:ins w:id="60" w:author="Tsao, Carolyn (ELC)" w:date="2025-12-11T20:46:00Z">
+        <w:r>
+          <w:rPr>
+            <w:rFonts w:ascii="Times New Roman" w:hAnsi="Times New Roman" w:cs="Times New Roman"/>
+          </w:rPr>
+          <w:t>For instance,</w:t>
+        </w:r>
+      </w:ins>
+      <w:ins w:id="61" w:author="Tsao, Carolyn (ELC)" w:date="2025-12-11T20:41:00Z">
+        <w:r>
+          <w:rPr>
+            <w:rFonts w:ascii="Times New Roman" w:hAnsi="Times New Roman" w:cs="Times New Roman"/>
+          </w:rPr>
+          <w:t xml:space="preserve"> </w:t>
+        </w:r>
+      </w:ins>
+      <w:ins w:id="62" w:author="Tsao, Carolyn (ELC)" w:date="2025-12-11T20:38:00Z">
+        <w:r>
+          <w:rPr>
+            <w:rFonts w:ascii="Times New Roman" w:hAnsi="Times New Roman" w:cs="Times New Roman"/>
+          </w:rPr>
+          <w:t>linkage rates</w:t>
+        </w:r>
+      </w:ins>
+      <w:ins w:id="63" w:author="Tsao, Carolyn (ELC)" w:date="2025-12-11T20:34:00Z">
+        <w:r>
+          <w:rPr>
+            <w:rFonts w:ascii="Times New Roman" w:hAnsi="Times New Roman" w:cs="Times New Roman"/>
+          </w:rPr>
+          <w:t xml:space="preserve"> </w:t>
+        </w:r>
+      </w:ins>
+      <w:ins w:id="64" w:author="Tsao, Carolyn (ELC)" w:date="2025-12-11T20:38:00Z">
+        <w:r>
+          <w:rPr>
+            <w:rFonts w:ascii="Times New Roman" w:hAnsi="Times New Roman" w:cs="Times New Roman"/>
+          </w:rPr>
+          <w:t>differ by women’s</w:t>
+        </w:r>
+      </w:ins>
+      <w:ins w:id="65" w:author="Tsao, Carolyn (ELC)" w:date="2025-12-11T20:34:00Z">
+        <w:r>
+          <w:rPr>
+            <w:rFonts w:ascii="Times New Roman" w:hAnsi="Times New Roman" w:cs="Times New Roman"/>
+          </w:rPr>
+          <w:t xml:space="preserve"> marital </w:t>
+        </w:r>
+      </w:ins>
+      <w:ins w:id="66" w:author="Tsao, Carolyn (ELC)" w:date="2025-12-11T20:46:00Z">
+        <w:r>
+          <w:rPr>
+            <w:rFonts w:ascii="Times New Roman" w:hAnsi="Times New Roman" w:cs="Times New Roman"/>
+          </w:rPr>
+          <w:t>and</w:t>
+        </w:r>
+      </w:ins>
+      <w:ins w:id="67" w:author="Tsao, Carolyn (ELC)" w:date="2025-12-11T20:38:00Z">
+        <w:r>
+          <w:rPr>
+            <w:rFonts w:ascii="Times New Roman" w:hAnsi="Times New Roman" w:cs="Times New Roman"/>
+          </w:rPr>
+          <w:t xml:space="preserve"> employment status</w:t>
+        </w:r>
+      </w:ins>
+      <w:ins w:id="68" w:author="Tsao, Carolyn (ELC)" w:date="2025-12-11T20:41:00Z">
+        <w:r>
+          <w:rPr>
+            <w:rFonts w:ascii="Times New Roman" w:hAnsi="Times New Roman" w:cs="Times New Roman"/>
+          </w:rPr>
+          <w:t>.</w:t>
+        </w:r>
+      </w:ins>
+      <w:ins w:id="69" w:author="Tsao, Carolyn (ELC)" w:date="2025-12-11T20:34:00Z">
+        <w:r>
+          <w:rPr>
+            <w:rFonts w:ascii="Times New Roman" w:hAnsi="Times New Roman" w:cs="Times New Roman"/>
+          </w:rPr>
+          <w:t xml:space="preserve"> On one hand, because single women who get married between censuses are less likely to be linked, single women who get married are underrepresented in our linked samples. As a result, using the linked data, our estimated effects of the prohibitions on the likelihood that a woman in </w:t>
+        </w:r>
+      </w:ins>
+      <w:ins w:id="70" w:author="Tsao, Carolyn (ELC)" w:date="2025-12-11T20:37:00Z">
+        <w:r>
+          <w:rPr>
+            <w:rFonts w:ascii="Times New Roman" w:hAnsi="Times New Roman" w:cs="Times New Roman"/>
+            <w:i/>
+            <w:iCs/>
+          </w:rPr>
+          <w:t xml:space="preserve">t-10 </w:t>
+        </w:r>
+      </w:ins>
+      <w:ins w:id="71" w:author="Tsao, Carolyn (ELC)" w:date="2025-12-11T20:34:00Z">
+        <w:r>
+          <w:rPr>
+            <w:rFonts w:ascii="Times New Roman" w:hAnsi="Times New Roman" w:cs="Times New Roman"/>
+          </w:rPr>
+          <w:t xml:space="preserve">is married in </w:t>
+        </w:r>
+      </w:ins>
+      <w:ins w:id="72" w:author="Tsao, Carolyn (ELC)" w:date="2025-12-11T20:37:00Z">
+        <w:r>
+          <w:rPr>
+            <w:rFonts w:ascii="Times New Roman" w:hAnsi="Times New Roman" w:cs="Times New Roman"/>
+            <w:i/>
+            <w:iCs/>
+          </w:rPr>
+          <w:t xml:space="preserve">t </w:t>
+        </w:r>
+      </w:ins>
+      <w:ins w:id="73" w:author="Tsao, Carolyn (ELC)" w:date="2025-12-11T20:34:00Z">
+        <w:r>
+          <w:rPr>
+            <w:rFonts w:ascii="Times New Roman" w:hAnsi="Times New Roman" w:cs="Times New Roman"/>
+          </w:rPr>
+          <w:t xml:space="preserve">are attenuated towards zero. On the other hand, single women who stop working because they got married between censuses are also underrepresented in our linked samples. As a result, using the linked data, our estimated effects of the prohibitions on the likelihood that a woman in </w:t>
+        </w:r>
+      </w:ins>
+      <w:ins w:id="74" w:author="Tsao, Carolyn (ELC)" w:date="2025-12-11T20:37:00Z">
+        <w:r>
+          <w:rPr>
+            <w:rFonts w:ascii="Times New Roman" w:hAnsi="Times New Roman" w:cs="Times New Roman"/>
+            <w:i/>
+            <w:iCs/>
+          </w:rPr>
+          <w:t xml:space="preserve">t-10 </w:t>
+        </w:r>
+      </w:ins>
+      <w:ins w:id="75" w:author="Tsao, Carolyn (ELC)" w:date="2025-12-11T20:34:00Z">
+        <w:r>
+          <w:rPr>
+            <w:rFonts w:ascii="Times New Roman" w:hAnsi="Times New Roman" w:cs="Times New Roman"/>
+          </w:rPr>
+          <w:t xml:space="preserve">is working in </w:t>
+        </w:r>
+      </w:ins>
+      <w:ins w:id="76" w:author="Tsao, Carolyn (ELC)" w:date="2025-12-11T20:37:00Z">
+        <w:r>
+          <w:rPr>
+            <w:rFonts w:ascii="Times New Roman" w:hAnsi="Times New Roman" w:cs="Times New Roman"/>
+            <w:i/>
+            <w:iCs/>
+          </w:rPr>
+          <w:t xml:space="preserve">t </w:t>
+        </w:r>
+      </w:ins>
+      <w:ins w:id="77" w:author="Tsao, Carolyn (ELC)" w:date="2025-12-11T20:34:00Z">
+        <w:r>
+          <w:rPr>
+            <w:rFonts w:ascii="Times New Roman" w:hAnsi="Times New Roman" w:cs="Times New Roman"/>
+          </w:rPr>
+          <w:t>are upward biased. It is difficult to bound these biases, as doing so would require estimating the number of single women who get married whom we are unable to link, which is inherently unobserved. However, what we can say is that our main estimate of interest in our linked analyses</w:t>
+        </w:r>
+      </w:ins>
+      <w:ins w:id="78" w:author="Tsao, Carolyn (ELC)" w:date="2025-12-11T20:36:00Z">
+        <w:r>
+          <w:rPr>
+            <w:rFonts w:ascii="Times New Roman" w:hAnsi="Times New Roman" w:cs="Times New Roman"/>
+          </w:rPr>
+          <w:t xml:space="preserve"> – </w:t>
+        </w:r>
+      </w:ins>
+      <w:ins w:id="79" w:author="Tsao, Carolyn (ELC)" w:date="2025-12-11T20:34:00Z">
+        <w:r>
+          <w:rPr>
+            <w:rFonts w:ascii="Times New Roman" w:hAnsi="Times New Roman" w:cs="Times New Roman"/>
+          </w:rPr>
+          <w:t xml:space="preserve">that is, the effect of the prohibitions on the likelihood that women in </w:t>
+        </w:r>
+      </w:ins>
+      <w:ins w:id="80" w:author="Tsao, Carolyn (ELC)" w:date="2025-12-11T20:37:00Z">
+        <w:r>
+          <w:rPr>
+            <w:rFonts w:ascii="Times New Roman" w:hAnsi="Times New Roman" w:cs="Times New Roman"/>
+            <w:i/>
+            <w:iCs/>
+          </w:rPr>
+          <w:t xml:space="preserve">t-10 </w:t>
+        </w:r>
+      </w:ins>
+      <w:ins w:id="81" w:author="Tsao, Carolyn (ELC)" w:date="2025-12-11T20:34:00Z">
+        <w:r>
+          <w:rPr>
+            <w:rFonts w:ascii="Times New Roman" w:hAnsi="Times New Roman" w:cs="Times New Roman"/>
+          </w:rPr>
+          <w:t xml:space="preserve">become married women teachers in </w:t>
+        </w:r>
+      </w:ins>
+      <w:ins w:id="82" w:author="Tsao, Carolyn (ELC)" w:date="2025-12-11T20:36:00Z">
+        <w:r>
+          <w:rPr>
+            <w:rFonts w:ascii="Times New Roman" w:hAnsi="Times New Roman" w:cs="Times New Roman"/>
+            <w:i/>
+            <w:iCs/>
+          </w:rPr>
+          <w:t>t</w:t>
+        </w:r>
+        <w:r>
+          <w:rPr>
+            <w:rFonts w:ascii="Times New Roman" w:hAnsi="Times New Roman" w:cs="Times New Roman"/>
+          </w:rPr>
+          <w:t xml:space="preserve"> – </w:t>
+        </w:r>
+      </w:ins>
+      <w:ins w:id="83" w:author="Tsao, Carolyn (ELC)" w:date="2025-12-11T20:34:00Z">
+        <w:r>
+          <w:rPr>
+            <w:rFonts w:ascii="Times New Roman" w:hAnsi="Times New Roman" w:cs="Times New Roman"/>
+          </w:rPr>
+          <w:t>is ambiguously biased due to linkage loss, given it is subject to two sources of bias that go in opposite directions and could even negate each other.</w:t>
+        </w:r>
+      </w:ins>
+    </w:p>
+    <w:p>
+      <w:pPr>
+        <w:spacing w:line="420" w:lineRule="auto"/>
+        <w:ind w:left="0" w:firstLine="720"/>
+        <w:rPr>
+          <w:rFonts w:ascii="Times New Roman" w:hAnsi="Times New Roman" w:cs="Times New Roman"/>
+        </w:rPr>
+        <w:pPrChange w:id="84" w:author="Tsao, Carolyn (ELC)" w:date="2025-12-11T20:44:00Z">
+          <w:pPr>
+            <w:spacing w:line="420" w:lineRule="auto"/>
+            <w:ind w:left="0" w:firstLine="0"/>
+          </w:pPr>
+        </w:pPrChange>
+      </w:pPr>
+      <w:ins w:id="85" w:author="Tsao, Carolyn (ELC)" w:date="2025-12-11T20:47:00Z">
+        <w:r>
+          <w:rPr>
+            <w:rFonts w:ascii="Times New Roman" w:hAnsi="Times New Roman" w:cs="Times New Roman"/>
+          </w:rPr>
+          <w:t xml:space="preserve">Another </w:t>
+        </w:r>
+      </w:ins>
+      <w:ins w:id="86" w:author="Tsao, Carolyn (ELC)" w:date="2025-12-11T20:48:00Z">
+        <w:r>
+          <w:rPr>
+            <w:rFonts w:ascii="Times New Roman" w:hAnsi="Times New Roman" w:cs="Times New Roman"/>
+          </w:rPr>
+          <w:t xml:space="preserve">potential concern </w:t>
+        </w:r>
+      </w:ins>
+      <w:ins w:id="87" w:author="Tsao, Carolyn (ELC)" w:date="2025-12-11T20:51:00Z">
+        <w:r>
+          <w:rPr>
+            <w:rFonts w:ascii="Times New Roman" w:hAnsi="Times New Roman" w:cs="Times New Roman"/>
+          </w:rPr>
+          <w:t xml:space="preserve">is that linkage rates may differ by women’s level of education. </w:t>
+        </w:r>
+        <w:r>
+          <w:rPr>
+            <w:rFonts w:ascii="Times New Roman" w:hAnsi="Times New Roman" w:cs="Times New Roman"/>
+          </w:rPr>
+          <w:t xml:space="preserve">If </w:t>
+        </w:r>
+      </w:ins>
+      <w:ins w:id="88" w:author="Tsao, Carolyn (ELC)" w:date="2025-12-11T20:52:00Z">
+        <w:r>
+          <w:rPr>
+            <w:rFonts w:ascii="Times New Roman" w:hAnsi="Times New Roman" w:cs="Times New Roman"/>
+          </w:rPr>
+          <w:t xml:space="preserve">more educated women are more </w:t>
+        </w:r>
+      </w:ins>
+      <w:ins w:id="89" w:author="Tsao, Carolyn (ELC)" w:date="2025-12-11T20:54:00Z">
+        <w:r>
+          <w:rPr>
+            <w:rFonts w:ascii="Times New Roman" w:hAnsi="Times New Roman" w:cs="Times New Roman"/>
+          </w:rPr>
+          <w:t xml:space="preserve">able </w:t>
+        </w:r>
+      </w:ins>
+      <w:ins w:id="90" w:author="Amy Kim" w:date="2025-12-12T11:00:00Z">
+        <w:r>
+          <w:rPr>
+            <w:rFonts w:ascii="Times New Roman" w:hAnsi="Times New Roman" w:cs="Times New Roman"/>
+          </w:rPr>
+          <w:t xml:space="preserve">to find employment </w:t>
+        </w:r>
+      </w:ins>
+      <w:ins w:id="91" w:author="Tsao, Carolyn (ELC)" w:date="2025-12-11T20:54:00Z">
+        <w:r>
+          <w:rPr>
+            <w:rFonts w:ascii="Times New Roman" w:hAnsi="Times New Roman" w:cs="Times New Roman"/>
+          </w:rPr>
+          <w:t>and more likely</w:t>
+        </w:r>
+      </w:ins>
+      <w:ins w:id="92" w:author="Tsao, Carolyn (ELC)" w:date="2025-12-11T20:52:00Z">
+        <w:r>
+          <w:rPr>
+            <w:rFonts w:ascii="Times New Roman" w:hAnsi="Times New Roman" w:cs="Times New Roman"/>
+          </w:rPr>
+          <w:t xml:space="preserve"> to </w:t>
+        </w:r>
+      </w:ins>
+      <w:ins w:id="93" w:author="Tsao, Carolyn (ELC)" w:date="2025-12-11T20:53:00Z">
+        <w:r>
+          <w:rPr>
+            <w:rFonts w:ascii="Times New Roman" w:hAnsi="Times New Roman" w:cs="Times New Roman"/>
+          </w:rPr>
+          <w:t xml:space="preserve">stay unmarried, then the unmarried women we are able to link across censuses may be selected on higher education. </w:t>
+        </w:r>
+      </w:ins>
+      <w:ins w:id="94" w:author="Tsao, Carolyn (ELC)" w:date="2025-12-11T20:54:00Z">
+        <w:r>
+          <w:rPr>
+            <w:rFonts w:ascii="Times New Roman" w:hAnsi="Times New Roman" w:cs="Times New Roman"/>
+          </w:rPr>
+          <w:t xml:space="preserve">As a result, </w:t>
+        </w:r>
+      </w:ins>
+      <w:ins w:id="95" w:author="Tsao, Carolyn (ELC)" w:date="2025-12-11T20:56:00Z">
+        <w:r>
+          <w:rPr>
+            <w:rFonts w:ascii="Times New Roman" w:hAnsi="Times New Roman" w:cs="Times New Roman"/>
+          </w:rPr>
+          <w:t xml:space="preserve">using the </w:t>
+        </w:r>
+      </w:ins>
+      <w:ins w:id="96" w:author="Tsao, Carolyn (ELC)" w:date="2025-12-11T20:57:00Z">
+        <w:r>
+          <w:rPr>
+            <w:rFonts w:ascii="Times New Roman" w:hAnsi="Times New Roman" w:cs="Times New Roman"/>
+          </w:rPr>
+          <w:t xml:space="preserve">linked data, we may obtain upward-biased estimates of the employment effects of the prohibitions on unmarried women, as the </w:t>
+        </w:r>
+      </w:ins>
+      <w:ins w:id="97" w:author="Tsao, Carolyn (ELC)" w:date="2025-12-11T21:03:00Z">
+        <w:r>
+          <w:rPr>
+            <w:rFonts w:ascii="Times New Roman" w:hAnsi="Times New Roman" w:cs="Times New Roman"/>
+          </w:rPr>
+          <w:t>linked women</w:t>
+        </w:r>
+      </w:ins>
+      <w:ins w:id="98" w:author="Tsao, Carolyn (ELC)" w:date="2025-12-11T20:57:00Z">
+        <w:r>
+          <w:rPr>
+            <w:rFonts w:ascii="Times New Roman" w:hAnsi="Times New Roman" w:cs="Times New Roman"/>
+          </w:rPr>
+          <w:t xml:space="preserve"> would be more</w:t>
+        </w:r>
+      </w:ins>
+      <w:ins w:id="99" w:author="Tsao, Carolyn (ELC)" w:date="2025-12-11T20:58:00Z">
+        <w:r>
+          <w:rPr>
+            <w:rFonts w:ascii="Times New Roman" w:hAnsi="Times New Roman" w:cs="Times New Roman"/>
+          </w:rPr>
+          <w:t xml:space="preserve"> likely</w:t>
+        </w:r>
+      </w:ins>
+      <w:ins w:id="100" w:author="Tsao, Carolyn (ELC)" w:date="2025-12-11T21:03:00Z">
+        <w:r>
+          <w:rPr>
+            <w:rFonts w:ascii="Times New Roman" w:hAnsi="Times New Roman" w:cs="Times New Roman"/>
+          </w:rPr>
+          <w:t xml:space="preserve"> to work</w:t>
+        </w:r>
+      </w:ins>
+      <w:ins w:id="101" w:author="Tsao, Carolyn (ELC)" w:date="2025-12-11T20:58:00Z">
+        <w:r>
+          <w:rPr>
+            <w:rFonts w:ascii="Times New Roman" w:hAnsi="Times New Roman" w:cs="Times New Roman"/>
+          </w:rPr>
+          <w:t xml:space="preserve"> than the average unmarried woman. It is difficult, however, for us to bound this bias, as education is not available in the census until 1940. </w:t>
+        </w:r>
+      </w:ins>
+      <w:ins w:id="102" w:author="Tsao, Carolyn (ELC)" w:date="2025-12-11T20:55:00Z">
+        <w:r>
+          <w:rPr>
+            <w:rFonts w:ascii="Times New Roman" w:hAnsi="Times New Roman" w:cs="Times New Roman"/>
+          </w:rPr>
+          <w:t xml:space="preserve"> </w:t>
+        </w:r>
+      </w:ins>
     </w:p>
     <w:p>
       <w:pPr>
@@ -2863,7 +3422,7 @@
           <w:color w:val="0000FF"/>
           <w:vertAlign w:val="superscript"/>
         </w:rPr>
-        <w:footnoteReference w:id="12"/>
+        <w:footnoteReference w:id="13"/>
       </w:r>
       <w:r>
         <w:rPr>
@@ -2916,7 +3475,7 @@
           <w:color w:val="0000FF"/>
           <w:vertAlign w:val="superscript"/>
         </w:rPr>
-        <w:footnoteReference w:id="13"/>
+        <w:footnoteReference w:id="14"/>
       </w:r>
       <w:r>
         <w:rPr>
@@ -3043,7 +3602,7 @@
           <w:color w:val="0000FF"/>
           <w:vertAlign w:val="superscript"/>
         </w:rPr>
-        <w:footnoteReference w:id="14"/>
+        <w:footnoteReference w:id="15"/>
       </w:r>
       <w:r>
         <w:rPr>
@@ -3058,7 +3617,7 @@
           <w:color w:val="0000FF"/>
           <w:vertAlign w:val="superscript"/>
         </w:rPr>
-        <w:footnoteReference w:id="15"/>
+        <w:footnoteReference w:id="16"/>
       </w:r>
     </w:p>
     <w:p>
@@ -3774,7 +4333,7 @@
           <w:color w:val="0000FF"/>
           <w:vertAlign w:val="superscript"/>
         </w:rPr>
-        <w:footnoteReference w:id="16"/>
+        <w:footnoteReference w:id="17"/>
       </w:r>
       <w:r>
         <w:rPr>
@@ -3790,7 +4349,7 @@
         </w:rPr>
         <w:t>The main parameter</w:t>
       </w:r>
-      <w:ins w:id="36" w:author="Amy Kim" w:date="2025-12-11T16:04:00Z">
+      <w:ins w:id="104" w:author="Amy Kim" w:date="2025-12-11T16:04:00Z">
         <w:r>
           <w:rPr>
             <w:rFonts w:ascii="Times New Roman" w:hAnsi="Times New Roman" w:cs="Times New Roman"/>
@@ -3804,7 +4363,7 @@
         </w:rPr>
         <w:t xml:space="preserve"> of interest </w:t>
       </w:r>
-      <w:ins w:id="37" w:author="Amy Kim" w:date="2025-12-11T16:04:00Z">
+      <w:ins w:id="105" w:author="Amy Kim" w:date="2025-12-11T16:04:00Z">
         <w:r>
           <w:rPr>
             <w:rFonts w:ascii="Times New Roman" w:hAnsi="Times New Roman" w:cs="Times New Roman"/>
@@ -3812,7 +4371,7 @@
           <w:t>are</w:t>
         </w:r>
       </w:ins>
-      <w:del w:id="38" w:author="Amy Kim" w:date="2025-12-11T16:04:00Z">
+      <w:del w:id="106" w:author="Amy Kim" w:date="2025-12-11T16:04:00Z">
         <w:r>
           <w:rPr>
             <w:rFonts w:ascii="Times New Roman" w:hAnsi="Times New Roman" w:cs="Times New Roman"/>
@@ -3846,7 +4405,7 @@
           </m:e>
           <m:sub>
             <m:r>
-              <w:ins w:id="39" w:author="Amy Kim" w:date="2025-12-11T16:04:00Z">
+              <w:ins w:id="107" w:author="Amy Kim" w:date="2025-12-11T16:04:00Z">
                 <w:rPr>
                   <w:rFonts w:ascii="Cambria Math" w:hAnsi="Cambria Math" w:cs="Times New Roman"/>
                 </w:rPr>
@@ -3854,7 +4413,7 @@
               </w:ins>
             </m:r>
             <m:r>
-              <w:ins w:id="40" w:author="Amy Kim" w:date="2025-12-11T16:05:00Z">
+              <w:ins w:id="108" w:author="Amy Kim" w:date="2025-12-11T16:05:00Z">
                 <w:rPr>
                   <w:rFonts w:ascii="Cambria Math" w:hAnsi="Cambria Math" w:cs="Times New Roman"/>
                 </w:rPr>
@@ -3862,7 +4421,7 @@
               </w:ins>
             </m:r>
             <m:r>
-              <w:del w:id="41" w:author="Amy Kim" w:date="2025-12-11T16:04:00Z">
+              <w:del w:id="109" w:author="Amy Kim" w:date="2025-12-11T16:04:00Z">
                 <w:rPr>
                   <w:rFonts w:ascii="Cambria Math" w:hAnsi="Cambria Math" w:cs="Times New Roman"/>
                 </w:rPr>
@@ -3880,7 +4439,7 @@
           </m:sup>
         </m:sSubSup>
       </m:oMath>
-      <w:ins w:id="42" w:author="Amy Kim" w:date="2025-12-11T16:05:00Z">
+      <w:ins w:id="110" w:author="Amy Kim" w:date="2025-12-11T16:05:00Z">
         <w:r>
           <w:rPr>
             <w:rFonts w:ascii="Times New Roman" w:hAnsi="Times New Roman" w:cs="Times New Roman"/>
@@ -3892,7 +4451,7 @@
         <m:sSubSup>
           <m:sSubSupPr>
             <m:ctrlPr>
-              <w:ins w:id="43" w:author="Amy Kim" w:date="2025-12-11T16:05:00Z">
+              <w:ins w:id="111" w:author="Amy Kim" w:date="2025-12-11T16:05:00Z">
                 <w:rPr>
                   <w:rFonts w:ascii="Cambria Math" w:hAnsi="Cambria Math" w:cs="Times New Roman"/>
                   <w:i/>
@@ -3902,7 +4461,7 @@
           </m:sSubSupPr>
           <m:e>
             <m:r>
-              <w:ins w:id="44" w:author="Amy Kim" w:date="2025-12-11T16:05:00Z">
+              <w:ins w:id="112" w:author="Amy Kim" w:date="2025-12-11T16:05:00Z">
                 <w:rPr>
                   <w:rFonts w:ascii="Cambria Math" w:hAnsi="Cambria Math" w:cs="Times New Roman"/>
                 </w:rPr>
@@ -3912,33 +4471,17 @@
           </m:e>
           <m:sub>
             <m:r>
-              <w:ins w:id="45" w:author="Amy Kim" w:date="2025-12-11T16:05:00Z">
+              <w:ins w:id="113" w:author="Amy Kim" w:date="2025-12-11T16:05:00Z">
                 <w:rPr>
                   <w:rFonts w:ascii="Cambria Math" w:hAnsi="Cambria Math" w:cs="Times New Roman"/>
                 </w:rPr>
-                <m:t>19</m:t>
-              </w:ins>
-            </m:r>
-            <m:r>
-              <w:ins w:id="46" w:author="Amy Kim" w:date="2025-12-11T16:05:00Z">
-                <w:rPr>
-                  <w:rFonts w:ascii="Cambria Math" w:hAnsi="Cambria Math" w:cs="Times New Roman"/>
-                </w:rPr>
-                <m:t>5</m:t>
-              </w:ins>
-            </m:r>
-            <m:r>
-              <w:ins w:id="47" w:author="Amy Kim" w:date="2025-12-11T16:05:00Z">
-                <w:rPr>
-                  <w:rFonts w:ascii="Cambria Math" w:hAnsi="Cambria Math" w:cs="Times New Roman"/>
-                </w:rPr>
-                <m:t>0</m:t>
+                <m:t>1950</m:t>
               </w:ins>
             </m:r>
           </m:sub>
           <m:sup>
             <m:r>
-              <w:ins w:id="48" w:author="Amy Kim" w:date="2025-12-11T16:05:00Z">
+              <w:ins w:id="114" w:author="Amy Kim" w:date="2025-12-11T16:05:00Z">
                 <w:rPr>
                   <w:rFonts w:ascii="Cambria Math" w:hAnsi="Cambria Math" w:cs="Times New Roman"/>
                 </w:rPr>
@@ -3948,7 +4491,7 @@
           </m:sup>
         </m:sSubSup>
       </m:oMath>
-      <w:ins w:id="49" w:author="Amy Kim" w:date="2025-12-11T16:05:00Z">
+      <w:ins w:id="115" w:author="Amy Kim" w:date="2025-12-11T16:05:00Z">
         <w:r>
           <w:rPr>
             <w:rFonts w:ascii="Times New Roman" w:hAnsi="Times New Roman" w:cs="Times New Roman"/>
@@ -3962,7 +4505,7 @@
         </w:rPr>
         <w:t xml:space="preserve">which, under certain assumptions, captures the effect of being in a treated state in </w:t>
       </w:r>
-      <w:del w:id="50" w:author="Amy Kim" w:date="2025-12-11T16:05:00Z">
+      <w:del w:id="116" w:author="Amy Kim" w:date="2025-12-11T16:05:00Z">
         <w:r>
           <w:rPr>
             <w:rFonts w:ascii="Times New Roman" w:hAnsi="Times New Roman" w:cs="Times New Roman"/>
@@ -3977,7 +4520,7 @@
           <w:delText>k</w:delText>
         </w:r>
       </w:del>
-      <w:ins w:id="51" w:author="Amy Kim" w:date="2025-12-11T16:05:00Z">
+      <w:ins w:id="117" w:author="Amy Kim" w:date="2025-12-11T16:05:00Z">
         <w:r>
           <w:rPr>
             <w:rFonts w:ascii="Times New Roman" w:hAnsi="Times New Roman" w:cs="Times New Roman"/>
@@ -4017,7 +4560,7 @@
           <w:color w:val="0000FF"/>
           <w:vertAlign w:val="superscript"/>
         </w:rPr>
-        <w:footnoteReference w:id="17"/>
+        <w:footnoteReference w:id="18"/>
       </w:r>
     </w:p>
     <w:p>
@@ -4672,6 +5215,7 @@
         </w:rPr>
         <w:t xml:space="preserve">− 10 </w:t>
       </w:r>
+      <w:proofErr w:type="gramStart"/>
       <w:r>
         <w:rPr>
           <w:rFonts w:ascii="Cambria Math" w:hAnsi="Cambria Math" w:cs="Cambria Math"/>
@@ -4682,7 +5226,14 @@
         <w:rPr>
           <w:rFonts w:ascii="Times New Roman" w:hAnsi="Times New Roman" w:cs="Times New Roman"/>
         </w:rPr>
-        <w:t>{1910</w:t>
+        <w:t>{</w:t>
+      </w:r>
+      <w:proofErr w:type="gramEnd"/>
+      <w:r>
+        <w:rPr>
+          <w:rFonts w:ascii="Times New Roman" w:hAnsi="Times New Roman" w:cs="Times New Roman"/>
+        </w:rPr>
+        <w:t>1910</w:t>
       </w:r>
       <w:r>
         <w:rPr>
@@ -4809,7 +5360,7 @@
           <w:color w:val="0000FF"/>
           <w:vertAlign w:val="superscript"/>
         </w:rPr>
-        <w:footnoteReference w:id="18"/>
+        <w:footnoteReference w:id="19"/>
       </w:r>
       <w:r>
         <w:rPr>
@@ -4994,7 +5545,7 @@
           <w:color w:val="0000FF"/>
           <w:vertAlign w:val="superscript"/>
         </w:rPr>
-        <w:footnoteReference w:id="19"/>
+        <w:footnoteReference w:id="20"/>
       </w:r>
       <w:r>
         <w:rPr>
@@ -5132,7 +5683,7 @@
           <w:color w:val="0000FF"/>
           <w:vertAlign w:val="superscript"/>
         </w:rPr>
-        <w:footnoteReference w:id="20"/>
+        <w:footnoteReference w:id="21"/>
       </w:r>
       <w:r>
         <w:rPr>
@@ -5184,7 +5735,7 @@
           <w:color w:val="0000FF"/>
           <w:vertAlign w:val="superscript"/>
         </w:rPr>
-        <w:footnoteReference w:id="21"/>
+        <w:footnoteReference w:id="22"/>
       </w:r>
       <w:r>
         <w:rPr>
@@ -5288,7 +5839,7 @@
           <w:color w:val="0000FF"/>
           <w:vertAlign w:val="superscript"/>
         </w:rPr>
-        <w:footnoteReference w:id="22"/>
+        <w:footnoteReference w:id="23"/>
       </w:r>
     </w:p>
     <w:p>
@@ -5621,7 +6172,7 @@
           <w:color w:val="0000FF"/>
           <w:vertAlign w:val="superscript"/>
         </w:rPr>
-        <w:footnoteReference w:id="23"/>
+        <w:footnoteReference w:id="24"/>
       </w:r>
       <w:r>
         <w:rPr>
@@ -5765,7 +6316,7 @@
           <w:color w:val="0000FF"/>
           <w:vertAlign w:val="superscript"/>
         </w:rPr>
-        <w:footnoteReference w:id="24"/>
+        <w:footnoteReference w:id="25"/>
       </w:r>
       <w:r>
         <w:rPr>
@@ -5852,7 +6403,7 @@
           <w:color w:val="0000FF"/>
           <w:vertAlign w:val="superscript"/>
         </w:rPr>
-        <w:footnoteReference w:id="25"/>
+        <w:footnoteReference w:id="26"/>
       </w:r>
     </w:p>
     <w:p>
@@ -5993,7 +6544,7 @@
           <w:color w:val="0000FF"/>
           <w:vertAlign w:val="superscript"/>
         </w:rPr>
-        <w:footnoteReference w:id="26"/>
+        <w:footnoteReference w:id="27"/>
       </w:r>
     </w:p>
     <w:p>
@@ -6159,7 +6710,21 @@
         <w:rPr>
           <w:rFonts w:ascii="Times New Roman" w:hAnsi="Times New Roman" w:cs="Times New Roman"/>
         </w:rPr>
-        <w:t>show that the increase in married women teachers was entirely offset by a 4.2 p.p. (7%) decrease in the share of teachers who were unmarried women, with no effect on the share of teachers who were men. We interpret the maintained ratio of men-to-women white teachers after the prohibitions as being consistent with two common beliefs that schools and other employers held at the time: (1) that men and women workers were imperfect substitutes, and/or (2) that employing men took priority over employing women. For example, schools that held the former belief might have allocated men and women teachers to different types of teaching positions (high schools or elementary schools, for instance) based on beliefs about comparative advantages, while schools that held the latter belief might have only hired a married woman at the expense of letting go of an unmarried women to uphold to the norm that men needed jobs to provide for their families.</w:t>
+        <w:t xml:space="preserve">show that the increase in married women teachers was entirely offset by a 4.2 p.p. (7%) decrease in the share of teachers who were unmarried women, with no effect on the share of teachers who were men. We interpret the maintained ratio of men-to-women white teachers after the prohibitions as being consistent with two common beliefs that schools and other employers held at the time: (1) that men and women workers were imperfect substitutes, and/or (2) that employing men took priority over employing women. For example, schools that held the former belief might have allocated men and women teachers to different types of teaching positions (high schools or elementary schools, for instance) based on beliefs about comparative advantages, while schools that held the latter belief might have only hired a married woman at the expense of letting go of an </w:t>
+      </w:r>
+      <w:proofErr w:type="gramStart"/>
+      <w:r>
+        <w:rPr>
+          <w:rFonts w:ascii="Times New Roman" w:hAnsi="Times New Roman" w:cs="Times New Roman"/>
+        </w:rPr>
+        <w:t>unmarried women</w:t>
+      </w:r>
+      <w:proofErr w:type="gramEnd"/>
+      <w:r>
+        <w:rPr>
+          <w:rFonts w:ascii="Times New Roman" w:hAnsi="Times New Roman" w:cs="Times New Roman"/>
+        </w:rPr>
+        <w:t xml:space="preserve"> to uphold to the norm that men needed jobs to provide for their families.</w:t>
       </w:r>
     </w:p>
     <w:p>
@@ -6271,7 +6836,7 @@
         </w:rPr>
         <w:t xml:space="preserve">(Columns 2 and 3), LFP (Columns 4 and 5), and mobility (Columns 6 and 7) of unmarried women teachers, where occupational scores function as a proxy for earnings given income was not collected in the Census prior to 1940. Although the prohibitions </w:t>
       </w:r>
-      <w:del w:id="52" w:author="Amy Kim" w:date="2025-12-11T16:27:00Z">
+      <w:del w:id="118" w:author="Amy Kim" w:date="2025-12-11T16:27:00Z">
         <w:r>
           <w:rPr>
             <w:rFonts w:ascii="Times New Roman" w:hAnsi="Times New Roman" w:cs="Times New Roman"/>
@@ -6279,7 +6844,7 @@
           <w:delText xml:space="preserve">increased </w:delText>
         </w:r>
       </w:del>
-      <w:ins w:id="53" w:author="Amy Kim" w:date="2025-12-11T16:27:00Z">
+      <w:ins w:id="119" w:author="Amy Kim" w:date="2025-12-11T16:27:00Z">
         <w:r>
           <w:rPr>
             <w:rFonts w:ascii="Times New Roman" w:hAnsi="Times New Roman" w:cs="Times New Roman"/>
@@ -6293,7 +6858,7 @@
           <w:t xml:space="preserve"> </w:t>
         </w:r>
       </w:ins>
-      <w:del w:id="54" w:author="Amy Kim" w:date="2025-12-11T16:07:00Z">
+      <w:del w:id="120" w:author="Amy Kim" w:date="2025-12-11T16:07:00Z">
         <w:r>
           <w:rPr>
             <w:rFonts w:ascii="Times New Roman" w:hAnsi="Times New Roman" w:cs="Times New Roman"/>
@@ -6301,7 +6866,7 @@
           <w:delText xml:space="preserve">occupational </w:delText>
         </w:r>
       </w:del>
-      <w:ins w:id="55" w:author="Amy Kim" w:date="2025-12-11T16:07:00Z">
+      <w:ins w:id="121" w:author="Amy Kim" w:date="2025-12-11T16:07:00Z">
         <w:r>
           <w:rPr>
             <w:rFonts w:ascii="Times New Roman" w:hAnsi="Times New Roman" w:cs="Times New Roman"/>
@@ -6321,7 +6886,7 @@
         </w:rPr>
         <w:t>scores and labor force participation</w:t>
       </w:r>
-      <w:del w:id="56" w:author="Amy Kim" w:date="2025-12-11T16:07:00Z">
+      <w:del w:id="122" w:author="Amy Kim" w:date="2025-12-11T16:07:00Z">
         <w:r>
           <w:rPr>
             <w:rFonts w:ascii="Times New Roman" w:hAnsi="Times New Roman" w:cs="Times New Roman"/>
@@ -6341,7 +6906,7 @@
           <w:color w:val="0000FF"/>
           <w:vertAlign w:val="superscript"/>
         </w:rPr>
-        <w:footnoteReference w:id="27"/>
+        <w:footnoteReference w:id="28"/>
       </w:r>
     </w:p>
     <w:p>
@@ -6349,17 +6914,314 @@
         <w:spacing w:line="420" w:lineRule="auto"/>
         <w:ind w:left="-15" w:firstLine="468"/>
         <w:rPr>
-          <w:rFonts w:ascii="Times New Roman" w:hAnsi="Times New Roman" w:cs="Times New Roman"/>
-        </w:rPr>
-      </w:pPr>
-      <w:r>
-        <w:rPr>
-          <w:rFonts w:ascii="Times New Roman" w:hAnsi="Times New Roman" w:cs="Times New Roman"/>
-        </w:rPr>
-        <w:lastRenderedPageBreak/>
-        <w:t>Finally, we detect no effect of the prohibitions on the overall LFP of women, as shown in Online Appendix Table B8. However, this result is unsurprising, given that the prohibitions only targeted teaching, and—despite teaching being an important occupation for women—teachers comprised only a small share of all women (2.2% of working-age women in 1930).</w:t>
-      </w:r>
-    </w:p>
+          <w:moveFrom w:id="123" w:author="Tsao, Carolyn (ELC)" w:date="2025-12-11T20:59:00Z"/>
+          <w:rFonts w:ascii="Times New Roman" w:hAnsi="Times New Roman" w:cs="Times New Roman"/>
+        </w:rPr>
+      </w:pPr>
+      <w:moveFromRangeStart w:id="124" w:author="Tsao, Carolyn (ELC)" w:date="2025-12-11T20:59:00Z" w:name="move216379183"/>
+      <w:moveFrom w:id="125" w:author="Tsao, Carolyn (ELC)" w:date="2025-12-11T20:59:00Z">
+        <w:r>
+          <w:rPr>
+            <w:rFonts w:ascii="Times New Roman" w:hAnsi="Times New Roman" w:cs="Times New Roman"/>
+          </w:rPr>
+          <w:lastRenderedPageBreak/>
+          <w:t>Finally, we detect no effect of the prohibitions on the overall LFP of women, as shown in Online Appendix Table B8. However, this result is unsurprising, given that the prohibitions only targeted teaching, and—despite teaching being an important occupation for women—teachers comprised only a small share of all women (2.2% of working-age women in 1930).</w:t>
+        </w:r>
+      </w:moveFrom>
+    </w:p>
+    <w:moveFromRangeEnd w:id="124"/>
+    <w:p>
+      <w:pPr>
+        <w:spacing w:line="420" w:lineRule="auto"/>
+        <w:ind w:left="-15" w:firstLine="468"/>
+        <w:rPr>
+          <w:moveTo w:id="126" w:author="Tsao, Carolyn (ELC)" w:date="2025-12-11T20:59:00Z"/>
+          <w:rFonts w:ascii="Times New Roman" w:hAnsi="Times New Roman" w:cs="Times New Roman"/>
+        </w:rPr>
+      </w:pPr>
+      <w:del w:id="127" w:author="Amy Kim" w:date="2025-12-12T14:17:00Z">
+        <w:r>
+          <w:rPr>
+            <w:rFonts w:ascii="Times New Roman" w:hAnsi="Times New Roman" w:cs="Times New Roman"/>
+          </w:rPr>
+          <w:delText>Taken together, our results suggest that the prohibitions</w:delText>
+        </w:r>
+      </w:del>
+      <w:ins w:id="128" w:author="Amy Kim" w:date="2025-12-12T14:17:00Z">
+        <w:r>
+          <w:rPr>
+            <w:rFonts w:ascii="Times New Roman" w:hAnsi="Times New Roman" w:cs="Times New Roman"/>
+          </w:rPr>
+          <w:t>In summary, we show that the prohibitions</w:t>
+        </w:r>
+      </w:ins>
+      <w:ins w:id="129" w:author="Amy Kim" w:date="2025-12-12T14:13:00Z">
+        <w:r>
+          <w:rPr>
+            <w:rFonts w:ascii="Times New Roman" w:hAnsi="Times New Roman" w:cs="Times New Roman"/>
+          </w:rPr>
+          <w:t xml:space="preserve"> pulled married women into the workforce</w:t>
+        </w:r>
+      </w:ins>
+      <w:ins w:id="130" w:author="Amy Kim" w:date="2025-12-12T14:17:00Z">
+        <w:r>
+          <w:rPr>
+            <w:rFonts w:ascii="Times New Roman" w:hAnsi="Times New Roman" w:cs="Times New Roman"/>
+          </w:rPr>
+          <w:t xml:space="preserve">, both through </w:t>
+        </w:r>
+      </w:ins>
+      <w:ins w:id="131" w:author="Amy Kim" w:date="2025-12-12T14:18:00Z">
+        <w:r>
+          <w:rPr>
+            <w:rFonts w:ascii="Times New Roman" w:hAnsi="Times New Roman" w:cs="Times New Roman"/>
+          </w:rPr>
+          <w:t xml:space="preserve">the </w:t>
+        </w:r>
+      </w:ins>
+      <w:ins w:id="132" w:author="Amy Kim" w:date="2025-12-12T14:17:00Z">
+        <w:r>
+          <w:rPr>
+            <w:rFonts w:ascii="Times New Roman" w:hAnsi="Times New Roman" w:cs="Times New Roman"/>
+          </w:rPr>
+          <w:t xml:space="preserve">retention of incumbent teachers </w:t>
+        </w:r>
+      </w:ins>
+      <w:ins w:id="133" w:author="Amy Kim" w:date="2025-12-12T14:18:00Z">
+        <w:r>
+          <w:rPr>
+            <w:rFonts w:ascii="Times New Roman" w:hAnsi="Times New Roman" w:cs="Times New Roman"/>
+          </w:rPr>
+          <w:t xml:space="preserve">who got married and through the increased hiring of </w:t>
+        </w:r>
+        <w:r>
+          <w:rPr>
+            <w:rFonts w:ascii="Times New Roman" w:hAnsi="Times New Roman" w:cs="Times New Roman"/>
+          </w:rPr>
+          <w:t xml:space="preserve">women who were originally outside of the labor force. We also show that this </w:t>
+        </w:r>
+      </w:ins>
+      <w:ins w:id="134" w:author="Amy Kim" w:date="2025-12-12T14:19:00Z">
+        <w:r>
+          <w:rPr>
+            <w:rFonts w:ascii="Times New Roman" w:hAnsi="Times New Roman" w:cs="Times New Roman"/>
+          </w:rPr>
+          <w:t xml:space="preserve">effect did not come at the expense of incumbent teachers who remained unmarried—these teachers </w:t>
+        </w:r>
+      </w:ins>
+      <w:del w:id="135" w:author="Amy Kim" w:date="2025-12-12T14:13:00Z">
+        <w:r>
+          <w:rPr>
+            <w:rFonts w:ascii="Times New Roman" w:hAnsi="Times New Roman" w:cs="Times New Roman"/>
+          </w:rPr>
+          <w:delText xml:space="preserve"> </w:delText>
+        </w:r>
+      </w:del>
+      <w:del w:id="136" w:author="Amy Kim" w:date="2025-12-12T14:08:00Z">
+        <w:r>
+          <w:rPr>
+            <w:rFonts w:ascii="Times New Roman" w:hAnsi="Times New Roman" w:cs="Times New Roman"/>
+          </w:rPr>
+          <w:delText xml:space="preserve">increased women’s </w:delText>
+        </w:r>
+      </w:del>
+      <w:del w:id="137" w:author="Amy Kim" w:date="2025-12-12T14:19:00Z">
+        <w:r>
+          <w:rPr>
+            <w:rFonts w:ascii="Times New Roman" w:hAnsi="Times New Roman" w:cs="Times New Roman"/>
+          </w:rPr>
+          <w:delText xml:space="preserve">LFP </w:delText>
+        </w:r>
+      </w:del>
+      <w:del w:id="138" w:author="Amy Kim" w:date="2025-12-12T14:08:00Z">
+        <w:r>
+          <w:rPr>
+            <w:rFonts w:ascii="Times New Roman" w:hAnsi="Times New Roman" w:cs="Times New Roman"/>
+          </w:rPr>
+          <w:delText xml:space="preserve">and weakly </w:delText>
+        </w:r>
+        <w:commentRangeStart w:id="139"/>
+        <w:r>
+          <w:rPr>
+            <w:rFonts w:ascii="Times New Roman" w:hAnsi="Times New Roman" w:cs="Times New Roman"/>
+          </w:rPr>
+          <w:delText>increased women’s earnings</w:delText>
+        </w:r>
+        <w:commentRangeEnd w:id="139"/>
+        <w:r>
+          <w:rPr>
+            <w:rStyle w:val="CommentReference"/>
+          </w:rPr>
+          <w:commentReference w:id="139"/>
+        </w:r>
+        <w:r>
+          <w:rPr>
+            <w:rFonts w:ascii="Times New Roman" w:hAnsi="Times New Roman" w:cs="Times New Roman"/>
+          </w:rPr>
+          <w:delText>,</w:delText>
+        </w:r>
+      </w:del>
+      <w:del w:id="140" w:author="Amy Kim" w:date="2025-12-12T14:19:00Z">
+        <w:r>
+          <w:rPr>
+            <w:rFonts w:ascii="Times New Roman" w:hAnsi="Times New Roman" w:cs="Times New Roman"/>
+          </w:rPr>
+          <w:delText xml:space="preserve"> albeit only in the occupation that the prohibitions targeted. Unmarried women teachers who stayed unmarried </w:delText>
+        </w:r>
+      </w:del>
+      <w:r>
+        <w:rPr>
+          <w:rFonts w:ascii="Times New Roman" w:hAnsi="Times New Roman" w:cs="Times New Roman"/>
+        </w:rPr>
+        <w:t xml:space="preserve">maintained the same rate of LFP, either in teaching or in jobs that paid similarly to teaching (Online Appendix Table B5, Columns 2 and 4). </w:t>
+      </w:r>
+      <w:ins w:id="141" w:author="Amy Kim" w:date="2025-12-12T14:21:00Z">
+        <w:r>
+          <w:rPr>
+            <w:rFonts w:ascii="Times New Roman" w:hAnsi="Times New Roman" w:cs="Times New Roman"/>
+          </w:rPr>
+          <w:t>Together, these results suggest that the prohibitions had a net positive impact on women’s labor force participation.</w:t>
+        </w:r>
+      </w:ins>
+      <w:ins w:id="142" w:author="Amy Kim" w:date="2025-12-12T14:22:00Z">
+        <w:r>
+          <w:rPr>
+            <w:rFonts w:ascii="Times New Roman" w:hAnsi="Times New Roman" w:cs="Times New Roman"/>
+          </w:rPr>
+          <w:t xml:space="preserve"> </w:t>
+        </w:r>
+      </w:ins>
+      <w:del w:id="143" w:author="Amy Kim" w:date="2025-12-12T14:19:00Z">
+        <w:r>
+          <w:rPr>
+            <w:rFonts w:ascii="Times New Roman" w:hAnsi="Times New Roman" w:cs="Times New Roman"/>
+          </w:rPr>
+          <w:delText>However, unmarried women teachers who got married became significantly more likely to stay in the labor force, and thus earned significantly more than they would have otherwise (Online Appendix Table B5, Columns 3 and 5).</w:delText>
+        </w:r>
+      </w:del>
+      <w:ins w:id="144" w:author="Tsao, Carolyn (ELC)" w:date="2025-12-11T20:59:00Z">
+        <w:del w:id="145" w:author="Amy Kim" w:date="2025-12-12T14:19:00Z">
+          <w:r>
+            <w:rPr>
+              <w:rFonts w:ascii="Times New Roman" w:hAnsi="Times New Roman" w:cs="Times New Roman"/>
+            </w:rPr>
+            <w:delText xml:space="preserve"> </w:delText>
+          </w:r>
+        </w:del>
+      </w:ins>
+      <w:moveToRangeStart w:id="146" w:author="Tsao, Carolyn (ELC)" w:date="2025-12-11T20:59:00Z" w:name="move216379183"/>
+      <w:moveTo w:id="147" w:author="Tsao, Carolyn (ELC)" w:date="2025-12-11T20:59:00Z">
+        <w:del w:id="148" w:author="Tsao, Carolyn (ELC)" w:date="2025-12-11T20:59:00Z">
+          <w:r>
+            <w:rPr>
+              <w:rFonts w:ascii="Times New Roman" w:hAnsi="Times New Roman" w:cs="Times New Roman"/>
+            </w:rPr>
+            <w:delText>Finally</w:delText>
+          </w:r>
+        </w:del>
+      </w:moveTo>
+      <w:ins w:id="149" w:author="Tsao, Carolyn (ELC)" w:date="2025-12-11T21:00:00Z">
+        <w:r>
+          <w:rPr>
+            <w:rFonts w:ascii="Times New Roman" w:hAnsi="Times New Roman" w:cs="Times New Roman"/>
+          </w:rPr>
+          <w:t>That said</w:t>
+        </w:r>
+      </w:ins>
+      <w:moveTo w:id="150" w:author="Tsao, Carolyn (ELC)" w:date="2025-12-11T20:59:00Z">
+        <w:r>
+          <w:rPr>
+            <w:rFonts w:ascii="Times New Roman" w:hAnsi="Times New Roman" w:cs="Times New Roman"/>
+          </w:rPr>
+          <w:t xml:space="preserve">, </w:t>
+        </w:r>
+      </w:moveTo>
+      <w:ins w:id="151" w:author="Tsao, Carolyn (ELC)" w:date="2025-12-11T21:01:00Z">
+        <w:r>
+          <w:rPr>
+            <w:rFonts w:ascii="Times New Roman" w:hAnsi="Times New Roman" w:cs="Times New Roman"/>
+          </w:rPr>
+          <w:t xml:space="preserve">because </w:t>
+        </w:r>
+        <w:r>
+          <w:rPr>
+            <w:rFonts w:ascii="Times New Roman" w:hAnsi="Times New Roman" w:cs="Times New Roman"/>
+          </w:rPr>
+          <w:t>teachers comprised only a small share of all women (2.2% of working-age women in 1930)</w:t>
+        </w:r>
+        <w:r>
+          <w:rPr>
+            <w:rFonts w:ascii="Times New Roman" w:hAnsi="Times New Roman" w:cs="Times New Roman"/>
+          </w:rPr>
+          <w:t xml:space="preserve">, </w:t>
+        </w:r>
+      </w:ins>
+      <w:moveTo w:id="152" w:author="Tsao, Carolyn (ELC)" w:date="2025-12-11T20:59:00Z">
+        <w:r>
+          <w:rPr>
+            <w:rFonts w:ascii="Times New Roman" w:hAnsi="Times New Roman" w:cs="Times New Roman"/>
+          </w:rPr>
+          <w:t>we detect no</w:t>
+        </w:r>
+      </w:moveTo>
+      <w:ins w:id="153" w:author="Tsao, Carolyn (ELC)" w:date="2025-12-11T20:59:00Z">
+        <w:r>
+          <w:rPr>
+            <w:rFonts w:ascii="Times New Roman" w:hAnsi="Times New Roman" w:cs="Times New Roman"/>
+          </w:rPr>
+          <w:t xml:space="preserve"> </w:t>
+        </w:r>
+      </w:ins>
+      <w:ins w:id="154" w:author="Tsao, Carolyn (ELC)" w:date="2025-12-11T21:00:00Z">
+        <w:r>
+          <w:rPr>
+            <w:rFonts w:ascii="Times New Roman" w:hAnsi="Times New Roman" w:cs="Times New Roman"/>
+          </w:rPr>
+          <w:t>statistically significant</w:t>
+        </w:r>
+      </w:ins>
+      <w:moveTo w:id="155" w:author="Tsao, Carolyn (ELC)" w:date="2025-12-11T20:59:00Z">
+        <w:r>
+          <w:rPr>
+            <w:rFonts w:ascii="Times New Roman" w:hAnsi="Times New Roman" w:cs="Times New Roman"/>
+          </w:rPr>
+          <w:t xml:space="preserve"> effect of the prohibitions on the overall LFP of women, as shown in Online Appendix Table B8</w:t>
+        </w:r>
+      </w:moveTo>
+      <w:ins w:id="156" w:author="Amy Kim" w:date="2025-12-12T14:22:00Z">
+        <w:r>
+          <w:rPr>
+            <w:rFonts w:ascii="Times New Roman" w:hAnsi="Times New Roman" w:cs="Times New Roman"/>
+          </w:rPr>
+          <w:t xml:space="preserve"> (Ruggles, Nelson, Sobek, et al. 2024)</w:t>
+        </w:r>
+      </w:ins>
+      <w:moveTo w:id="157" w:author="Tsao, Carolyn (ELC)" w:date="2025-12-11T20:59:00Z">
+        <w:r>
+          <w:rPr>
+            <w:rFonts w:ascii="Times New Roman" w:hAnsi="Times New Roman" w:cs="Times New Roman"/>
+          </w:rPr>
+          <w:t xml:space="preserve">. </w:t>
+        </w:r>
+        <w:del w:id="158" w:author="Tsao, Carolyn (ELC)" w:date="2025-12-11T21:01:00Z">
+          <w:r>
+            <w:rPr>
+              <w:rFonts w:ascii="Times New Roman" w:hAnsi="Times New Roman" w:cs="Times New Roman"/>
+            </w:rPr>
+            <w:delText>However, this result is unsurprising, given that the prohibitions only targeted teaching, and—despite teaching being an important occupation for women—</w:delText>
+          </w:r>
+        </w:del>
+        <w:del w:id="159" w:author="Tsao, Carolyn (ELC)" w:date="2025-12-11T21:00:00Z">
+          <w:r>
+            <w:rPr>
+              <w:rFonts w:ascii="Times New Roman" w:hAnsi="Times New Roman" w:cs="Times New Roman"/>
+            </w:rPr>
+            <w:delText>teachers comprised only a small share of all women (2.2% of working-age women in 1930).</w:delText>
+          </w:r>
+        </w:del>
+      </w:moveTo>
+    </w:p>
+    <w:moveToRangeEnd w:id="146"/>
     <w:p>
       <w:pPr>
         <w:spacing w:after="427" w:line="420" w:lineRule="auto"/>
@@ -6368,12 +7230,6 @@
           <w:rFonts w:ascii="Times New Roman" w:hAnsi="Times New Roman" w:cs="Times New Roman"/>
         </w:rPr>
       </w:pPr>
-      <w:r>
-        <w:rPr>
-          <w:rFonts w:ascii="Times New Roman" w:hAnsi="Times New Roman" w:cs="Times New Roman"/>
-        </w:rPr>
-        <w:t>Taken together, our results suggest that the prohibitions increased women’s LFP and weakly increased women’s earnings, albeit only in the occupation that the prohibitions targeted. Unmarried women teachers who stayed unmarried maintained the same rate of LFP, either in teaching or in jobs that paid similarly to teaching (Online Appendix Table B5, Columns 2 and 4). However, unmarried women teachers who got married became significantly more likely to stay in the labor force, and thus earned significantly more than they would have otherwise (Online Appendix Table B5, Columns 3 and 5).</w:t>
-      </w:r>
     </w:p>
     <w:p>
       <w:pPr>
@@ -6723,7 +7579,140 @@
         <w:rPr>
           <w:rFonts w:ascii="Times New Roman" w:hAnsi="Times New Roman" w:cs="Times New Roman"/>
         </w:rPr>
-        <w:t>We find that the protections led to an increase in the share of teachers who were married women, an effect driven by white women who changed their decisions to work rather than their decisions to marry. We find no effect of the prohibitions on Black women’s employment in teaching, consistent with the fact that Black women had significantly higher rates of LFP during this time period. However, we also find that the increase was offset by a decrease in the share of teachers who were unmarried women, with no effect on men nor on the total number of teachers. We find evidence that the decrease was driven by incumbent unmarried women teachers switching from teaching to other similar-paying occupations. Overall, our findings suggest that while the policy did displace some unmarried women, the net effect on white women’s LFP was positive, as the policy pulled white married women into teaching who would have otherwise not been in the labor force. Our results are largely robust to various matching specifications.</w:t>
+        <w:t xml:space="preserve">We find that the protections led to an increase in the share of teachers who were married women, an effect driven by white women who changed their decisions to work rather than their decisions to marry. We find no effect of the prohibitions on Black women’s employment in teaching, consistent with the fact that Black women had significantly higher rates of LFP during this time period. However, we also find that the increase was offset by a decrease in the share of teachers who were unmarried women, with no effect on men nor on the total number of teachers. We find evidence that the decrease was driven by incumbent unmarried women teachers switching from teaching to other similar-paying occupations. Overall, our findings </w:t>
+      </w:r>
+      <w:del w:id="160" w:author="Amy Kim" w:date="2025-12-12T14:24:00Z">
+        <w:r>
+          <w:rPr>
+            <w:rFonts w:ascii="Times New Roman" w:hAnsi="Times New Roman" w:cs="Times New Roman"/>
+          </w:rPr>
+          <w:delText>suggest</w:delText>
+        </w:r>
+      </w:del>
+      <w:ins w:id="161" w:author="Amy Kim" w:date="2025-12-12T14:24:00Z">
+        <w:r>
+          <w:rPr>
+            <w:rFonts w:ascii="Times New Roman" w:hAnsi="Times New Roman" w:cs="Times New Roman"/>
+          </w:rPr>
+          <w:t>show</w:t>
+        </w:r>
+      </w:ins>
+      <w:del w:id="162" w:author="Amy Kim" w:date="2025-12-12T14:24:00Z">
+        <w:r>
+          <w:rPr>
+            <w:rFonts w:ascii="Times New Roman" w:hAnsi="Times New Roman" w:cs="Times New Roman"/>
+          </w:rPr>
+          <w:delText xml:space="preserve"> </w:delText>
+        </w:r>
+      </w:del>
+      <w:ins w:id="163" w:author="Amy Kim" w:date="2025-12-12T14:24:00Z">
+        <w:r>
+          <w:rPr>
+            <w:rFonts w:ascii="Times New Roman" w:hAnsi="Times New Roman" w:cs="Times New Roman"/>
+          </w:rPr>
+          <w:t xml:space="preserve"> </w:t>
+        </w:r>
+      </w:ins>
+      <w:r>
+        <w:rPr>
+          <w:rFonts w:ascii="Times New Roman" w:hAnsi="Times New Roman" w:cs="Times New Roman"/>
+        </w:rPr>
+        <w:t xml:space="preserve">that </w:t>
+      </w:r>
+      <w:del w:id="164" w:author="Amy Kim" w:date="2025-12-12T14:24:00Z">
+        <w:r>
+          <w:rPr>
+            <w:rFonts w:ascii="Times New Roman" w:hAnsi="Times New Roman" w:cs="Times New Roman"/>
+          </w:rPr>
+          <w:delText xml:space="preserve">while the policy did displace some unmarried women, the net effect on white women’s LFP was positive, as </w:delText>
+        </w:r>
+      </w:del>
+      <w:r>
+        <w:rPr>
+          <w:rFonts w:ascii="Times New Roman" w:hAnsi="Times New Roman" w:cs="Times New Roman"/>
+        </w:rPr>
+        <w:t>the policy pulled white married women into teaching who would have otherwise not been in the labor force</w:t>
+      </w:r>
+      <w:ins w:id="165" w:author="Amy Kim" w:date="2025-12-12T14:24:00Z">
+        <w:r>
+          <w:rPr>
+            <w:rFonts w:ascii="Times New Roman" w:hAnsi="Times New Roman" w:cs="Times New Roman"/>
+          </w:rPr>
+          <w:t xml:space="preserve">, and </w:t>
+        </w:r>
+        <w:r>
+          <w:rPr>
+            <w:rFonts w:ascii="Times New Roman" w:hAnsi="Times New Roman" w:cs="Times New Roman"/>
+          </w:rPr>
+          <w:t>while the policy did displace some unmarried women</w:t>
+        </w:r>
+        <w:r>
+          <w:rPr>
+            <w:rFonts w:ascii="Times New Roman" w:hAnsi="Times New Roman" w:cs="Times New Roman"/>
+          </w:rPr>
+          <w:t xml:space="preserve"> from teaching, </w:t>
+        </w:r>
+      </w:ins>
+      <w:ins w:id="166" w:author="Amy Kim" w:date="2025-12-12T14:25:00Z">
+        <w:r>
+          <w:rPr>
+            <w:rFonts w:ascii="Times New Roman" w:hAnsi="Times New Roman" w:cs="Times New Roman"/>
+          </w:rPr>
+          <w:t xml:space="preserve">they </w:t>
+        </w:r>
+      </w:ins>
+      <w:ins w:id="167" w:author="Amy Kim" w:date="2025-12-12T14:27:00Z">
+        <w:r>
+          <w:rPr>
+            <w:rFonts w:ascii="Times New Roman" w:hAnsi="Times New Roman" w:cs="Times New Roman"/>
+          </w:rPr>
+          <w:t xml:space="preserve">largely switched </w:t>
+        </w:r>
+      </w:ins>
+      <w:ins w:id="168" w:author="Amy Kim" w:date="2025-12-12T14:25:00Z">
+        <w:r>
+          <w:rPr>
+            <w:rFonts w:ascii="Times New Roman" w:hAnsi="Times New Roman" w:cs="Times New Roman"/>
+          </w:rPr>
+          <w:t xml:space="preserve">into </w:t>
+        </w:r>
+        <w:r>
+          <w:rPr>
+            <w:rFonts w:ascii="Times New Roman" w:hAnsi="Times New Roman" w:cs="Times New Roman"/>
+          </w:rPr>
+          <w:lastRenderedPageBreak/>
+          <w:t xml:space="preserve">other </w:t>
+        </w:r>
+      </w:ins>
+      <w:ins w:id="169" w:author="Amy Kim" w:date="2025-12-12T14:28:00Z">
+        <w:r>
+          <w:rPr>
+            <w:rFonts w:ascii="Times New Roman" w:hAnsi="Times New Roman" w:cs="Times New Roman"/>
+          </w:rPr>
+          <w:t>occupations and did not reduce their labor force participation</w:t>
+        </w:r>
+      </w:ins>
+      <w:ins w:id="170" w:author="Amy Kim" w:date="2025-12-12T14:26:00Z">
+        <w:r>
+          <w:rPr>
+            <w:rFonts w:ascii="Times New Roman" w:hAnsi="Times New Roman" w:cs="Times New Roman"/>
+          </w:rPr>
+          <w:t>.</w:t>
+        </w:r>
+      </w:ins>
+      <w:del w:id="171" w:author="Amy Kim" w:date="2025-12-12T14:24:00Z">
+        <w:r>
+          <w:rPr>
+            <w:rFonts w:ascii="Times New Roman" w:hAnsi="Times New Roman" w:cs="Times New Roman"/>
+          </w:rPr>
+          <w:delText>.</w:delText>
+        </w:r>
+      </w:del>
+      <w:r>
+        <w:rPr>
+          <w:rFonts w:ascii="Times New Roman" w:hAnsi="Times New Roman" w:cs="Times New Roman"/>
+        </w:rPr>
+        <w:t xml:space="preserve"> Our results are largely robust to various matching specifications.</w:t>
       </w:r>
     </w:p>
     <w:p>
@@ -6738,7 +7727,6 @@
         <w:rPr>
           <w:rFonts w:ascii="Times New Roman" w:hAnsi="Times New Roman" w:cs="Times New Roman"/>
         </w:rPr>
-        <w:lastRenderedPageBreak/>
         <w:t>Our study provides causal evidence that despite the strong social norm that married women stay out of the labor force in early 1900s U.S., there was demand among white women to work while married. Making discriminatory hiring practices against married women illegal in one occupation, even as early as the 1930s, pulled more white married women into the labor market in just a few years.</w:t>
       </w:r>
     </w:p>
@@ -6924,6 +7912,7 @@
         <w:rPr>
           <w:rFonts w:ascii="Times New Roman" w:hAnsi="Times New Roman" w:cs="Times New Roman"/>
         </w:rPr>
+        <w:lastRenderedPageBreak/>
         <w:t>Acemoglu, Daron, and Joshua D Angrist. “Consequences of Employment Protection? The</w:t>
       </w:r>
     </w:p>
@@ -6939,7 +7928,6 @@
         <w:rPr>
           <w:rFonts w:ascii="Times New Roman" w:hAnsi="Times New Roman" w:cs="Times New Roman"/>
         </w:rPr>
-        <w:lastRenderedPageBreak/>
         <w:t xml:space="preserve">Case of the Americans with Disabilities Act.” </w:t>
       </w:r>
       <w:r>
@@ -7210,6 +8198,7 @@
         <w:rPr>
           <w:rFonts w:ascii="Times New Roman" w:hAnsi="Times New Roman" w:cs="Times New Roman"/>
         </w:rPr>
+        <w:lastRenderedPageBreak/>
         <w:t xml:space="preserve">Bohan, Chara H, and Wesley Null. “Gender and the Evolution of Normal School Education: A Historical Analysis of Teacher Education Institutions.” </w:t>
       </w:r>
       <w:r>
@@ -7239,7 +8228,6 @@
         <w:rPr>
           <w:rFonts w:ascii="Times New Roman" w:hAnsi="Times New Roman" w:cs="Times New Roman"/>
         </w:rPr>
-        <w:lastRenderedPageBreak/>
         <w:t>Boustan</w:t>
       </w:r>
       <w:proofErr w:type="spellEnd"/>
@@ -7534,6 +8522,7 @@
         <w:rPr>
           <w:rFonts w:ascii="Times New Roman" w:hAnsi="Times New Roman" w:cs="Times New Roman"/>
         </w:rPr>
+        <w:lastRenderedPageBreak/>
         <w:t xml:space="preserve">Costa, Dora L. “From Mill Town to Board Room: The Rise of Women’s Paid Labor.” </w:t>
       </w:r>
       <w:r>
@@ -7585,7 +8574,6 @@
           <w:rFonts w:ascii="Times New Roman" w:hAnsi="Times New Roman" w:cs="Times New Roman"/>
           <w:i/>
         </w:rPr>
-        <w:lastRenderedPageBreak/>
         <w:t xml:space="preserve">Daily Press, </w:t>
       </w:r>
       <w:r>
@@ -7859,6 +8847,7 @@
           <w:rFonts w:ascii="Times New Roman" w:eastAsia="Calibri" w:hAnsi="Times New Roman" w:cs="Times New Roman"/>
           <w:noProof/>
         </w:rPr>
+        <w:lastRenderedPageBreak/>
         <mc:AlternateContent>
           <mc:Choice Requires="wpg">
             <w:drawing>
@@ -7983,7 +8972,6 @@
           <w:rFonts w:ascii="Times New Roman" w:eastAsia="Calibri" w:hAnsi="Times New Roman" w:cs="Times New Roman"/>
           <w:noProof/>
         </w:rPr>
-        <w:lastRenderedPageBreak/>
         <mc:AlternateContent>
           <mc:Choice Requires="wpg">
             <w:drawing>
@@ -8376,6 +9364,7 @@
         <w:rPr>
           <w:rFonts w:ascii="Times New Roman" w:hAnsi="Times New Roman" w:cs="Times New Roman"/>
         </w:rPr>
+        <w:lastRenderedPageBreak/>
         <w:t xml:space="preserve">Kline, Patrick, and Enrico Moretti. “Local Economic Development, Agglomeration Economies, and the Big Push: 100 Years of Evidence </w:t>
       </w:r>
       <w:proofErr w:type="gramStart"/>
@@ -8433,7 +9422,6 @@
         <w:rPr>
           <w:rFonts w:ascii="Times New Roman" w:hAnsi="Times New Roman" w:cs="Times New Roman"/>
         </w:rPr>
-        <w:lastRenderedPageBreak/>
         <w:t xml:space="preserve">Act.” </w:t>
       </w:r>
       <w:r>
@@ -8852,6 +9840,7 @@
           <w:rFonts w:ascii="Times New Roman" w:hAnsi="Times New Roman" w:cs="Times New Roman"/>
           <w:i/>
         </w:rPr>
+        <w:lastRenderedPageBreak/>
         <w:t>1920</w:t>
       </w:r>
       <w:r>
@@ -8998,7 +9987,6 @@
           <w:rFonts w:ascii="Times New Roman" w:eastAsia="Calibri" w:hAnsi="Times New Roman" w:cs="Times New Roman"/>
           <w:noProof/>
         </w:rPr>
-        <w:lastRenderedPageBreak/>
         <mc:AlternateContent>
           <mc:Choice Requires="wpg">
             <w:drawing>
@@ -9335,6 +10323,7 @@
         <w:rPr>
           <w:rFonts w:ascii="Times New Roman" w:hAnsi="Times New Roman" w:cs="Times New Roman"/>
         </w:rPr>
+        <w:lastRenderedPageBreak/>
         <w:t>Sun, Liyang, and Sarah Abraham. “Estimating Dynamic Treatment Effects in Event Studies</w:t>
       </w:r>
       <w:r>
@@ -9401,7 +10390,6 @@
         <w:rPr>
           <w:rFonts w:ascii="Times New Roman" w:hAnsi="Times New Roman" w:cs="Times New Roman"/>
         </w:rPr>
-        <w:lastRenderedPageBreak/>
         <w:t xml:space="preserve">U.S. Department of Education, National Center for Education Statistics. </w:t>
       </w:r>
       <w:r>
@@ -14064,9 +15052,9 @@
           <w:rFonts w:ascii="Times New Roman" w:hAnsi="Times New Roman" w:cs="Times New Roman"/>
         </w:rPr>
         <w:sectPr>
-          <w:footerReference w:type="even" r:id="rId8"/>
-          <w:footerReference w:type="default" r:id="rId9"/>
-          <w:footerReference w:type="first" r:id="rId10"/>
+          <w:footerReference w:type="even" r:id="rId12"/>
+          <w:footerReference w:type="default" r:id="rId13"/>
+          <w:footerReference w:type="first" r:id="rId14"/>
           <w:pgSz w:w="12240" w:h="15840"/>
           <w:pgMar w:top="1440" w:right="1440" w:bottom="1394" w:left="1440" w:header="720" w:footer="796" w:gutter="0"/>
           <w:cols w:space="720"/>
@@ -14362,8 +15350,17 @@
           <w:rFonts w:ascii="Times New Roman" w:hAnsi="Times New Roman" w:cs="Times New Roman"/>
           <w:sz w:val="20"/>
         </w:rPr>
-        <w:t>All teachers</w:t>
-      </w:r>
+        <w:t xml:space="preserve">All </w:t>
+      </w:r>
+      <w:proofErr w:type="gramStart"/>
+      <w:r>
+        <w:rPr>
+          <w:rFonts w:ascii="Times New Roman" w:hAnsi="Times New Roman" w:cs="Times New Roman"/>
+          <w:sz w:val="20"/>
+        </w:rPr>
+        <w:t>teachers</w:t>
+      </w:r>
+      <w:proofErr w:type="gramEnd"/>
       <w:r>
         <w:rPr>
           <w:rFonts w:ascii="Times New Roman" w:hAnsi="Times New Roman" w:cs="Times New Roman"/>
@@ -16719,9 +17716,9 @@
           <w:rFonts w:ascii="Times New Roman" w:hAnsi="Times New Roman" w:cs="Times New Roman"/>
         </w:rPr>
         <w:sectPr>
-          <w:footerReference w:type="even" r:id="rId11"/>
-          <w:footerReference w:type="default" r:id="rId12"/>
-          <w:footerReference w:type="first" r:id="rId13"/>
+          <w:footerReference w:type="even" r:id="rId15"/>
+          <w:footerReference w:type="default" r:id="rId16"/>
+          <w:footerReference w:type="first" r:id="rId17"/>
           <w:pgSz w:w="15840" w:h="12240" w:orient="landscape"/>
           <w:pgMar w:top="1440" w:right="2017" w:bottom="1440" w:left="2017" w:header="720" w:footer="720" w:gutter="0"/>
           <w:cols w:space="720"/>
@@ -17101,12 +18098,21 @@
                 <w:rFonts w:ascii="Times New Roman" w:hAnsi="Times New Roman" w:cs="Times New Roman"/>
               </w:rPr>
             </w:pPr>
+            <w:proofErr w:type="gramStart"/>
             <w:r>
               <w:rPr>
                 <w:rFonts w:ascii="Times New Roman" w:hAnsi="Times New Roman" w:cs="Times New Roman"/>
                 <w:sz w:val="17"/>
               </w:rPr>
-              <w:t xml:space="preserve">Pr(Married Not in LF in </w:t>
+              <w:t>Pr(</w:t>
+            </w:r>
+            <w:proofErr w:type="gramEnd"/>
+            <w:r>
+              <w:rPr>
+                <w:rFonts w:ascii="Times New Roman" w:hAnsi="Times New Roman" w:cs="Times New Roman"/>
+                <w:sz w:val="17"/>
+              </w:rPr>
+              <w:t xml:space="preserve">Married Not in LF in </w:t>
             </w:r>
             <w:r>
               <w:rPr>
@@ -23771,7 +24777,7 @@
                     <pic:cNvPicPr/>
                   </pic:nvPicPr>
                   <pic:blipFill>
-                    <a:blip r:embed="rId14"/>
+                    <a:blip r:embed="rId18"/>
                     <a:stretch>
                       <a:fillRect/>
                     </a:stretch>
@@ -23906,7 +24912,7 @@
                     <pic:cNvPicPr/>
                   </pic:nvPicPr>
                   <pic:blipFill>
-                    <a:blip r:embed="rId15"/>
+                    <a:blip r:embed="rId19"/>
                     <a:stretch>
                       <a:fillRect/>
                     </a:stretch>
@@ -23993,9 +24999,9 @@
           <w:rFonts w:ascii="Times New Roman" w:hAnsi="Times New Roman" w:cs="Times New Roman"/>
         </w:rPr>
         <w:sectPr>
-          <w:footerReference w:type="even" r:id="rId16"/>
-          <w:footerReference w:type="default" r:id="rId17"/>
-          <w:footerReference w:type="first" r:id="rId18"/>
+          <w:footerReference w:type="even" r:id="rId20"/>
+          <w:footerReference w:type="default" r:id="rId21"/>
+          <w:footerReference w:type="first" r:id="rId22"/>
           <w:pgSz w:w="12240" w:h="15840"/>
           <w:pgMar w:top="1440" w:right="1440" w:bottom="1791" w:left="1440" w:header="720" w:footer="796" w:gutter="0"/>
           <w:cols w:space="720"/>
@@ -24033,7 +25039,7 @@
                     <pic:cNvPicPr/>
                   </pic:nvPicPr>
                   <pic:blipFill>
-                    <a:blip r:embed="rId19"/>
+                    <a:blip r:embed="rId23"/>
                     <a:stretch>
                       <a:fillRect/>
                     </a:stretch>
@@ -24105,7 +25111,7 @@
                     <pic:cNvPicPr/>
                   </pic:nvPicPr>
                   <pic:blipFill>
-                    <a:blip r:embed="rId20"/>
+                    <a:blip r:embed="rId24"/>
                     <a:stretch>
                       <a:fillRect/>
                     </a:stretch>
@@ -24231,9 +25237,9 @@
       </w:r>
     </w:p>
     <w:sectPr>
-      <w:footerReference w:type="even" r:id="rId21"/>
-      <w:footerReference w:type="default" r:id="rId22"/>
-      <w:footerReference w:type="first" r:id="rId23"/>
+      <w:footerReference w:type="even" r:id="rId25"/>
+      <w:footerReference w:type="default" r:id="rId26"/>
+      <w:footerReference w:type="first" r:id="rId27"/>
       <w:pgSz w:w="12240" w:h="15840"/>
       <w:pgMar w:top="1440" w:right="1440" w:bottom="1440" w:left="1440" w:header="720" w:footer="1440" w:gutter="0"/>
       <w:cols w:space="720"/>
@@ -24241,6 +25247,49 @@
     </w:sectPr>
   </w:body>
 </w:document>
+</file>
+
+<file path=word/comments.xml><?xml version="1.0" encoding="utf-8"?>
+<w:comments xmlns:wpc="http://schemas.microsoft.com/office/word/2010/wordprocessingCanvas" xmlns:cx="http://schemas.microsoft.com/office/drawing/2014/chartex" xmlns:cx1="http://schemas.microsoft.com/office/drawing/2015/9/8/chartex" xmlns:cx2="http://schemas.microsoft.com/office/drawing/2015/10/21/chartex" xmlns:cx3="http://schemas.microsoft.com/office/drawing/2016/5/9/chartex" xmlns:cx4="http://schemas.microsoft.com/office/drawing/2016/5/10/chartex" xmlns:cx5="http://schemas.microsoft.com/office/drawing/2016/5/11/chartex" xmlns:cx6="http://schemas.microsoft.com/office/drawing/2016/5/12/chartex" xmlns:cx7="http://schemas.microsoft.com/office/drawing/2016/5/13/chartex" xmlns:cx8="http://schemas.microsoft.com/office/drawing/2016/5/14/chartex" xmlns:mc="http://schemas.openxmlformats.org/markup-compatibility/2006" xmlns:aink="http://schemas.microsoft.com/office/drawing/2016/ink" xmlns:am3d="http://schemas.microsoft.com/office/drawing/2017/model3d" xmlns:o="urn:schemas-microsoft-com:office:office" xmlns:oel="http://schemas.microsoft.com/office/2019/extlst" xmlns:r="http://schemas.openxmlformats.org/officeDocument/2006/relationships" xmlns:m="http://schemas.openxmlformats.org/officeDocument/2006/math" xmlns:v="urn:schemas-microsoft-com:vml" xmlns:wp14="http://schemas.microsoft.com/office/word/2010/wordprocessingDrawing" xmlns:wp="http://schemas.openxmlformats.org/drawingml/2006/wordprocessingDrawing" xmlns:w10="urn:schemas-microsoft-com:office:word" xmlns:w="http://schemas.openxmlformats.org/wordprocessingml/2006/main" xmlns:w14="http://schemas.microsoft.com/office/word/2010/wordml" xmlns:w15="http://schemas.microsoft.com/office/word/2012/wordml" xmlns:w16cex="http://schemas.microsoft.com/office/word/2018/wordml/cex" xmlns:w16cid="http://schemas.microsoft.com/office/word/2016/wordml/cid" xmlns:w16="http://schemas.microsoft.com/office/word/2018/wordml" xmlns:w16sdtdh="http://schemas.microsoft.com/office/word/2020/wordml/sdtdatahash" xmlns:w16se="http://schemas.microsoft.com/office/word/2015/wordml/symex" xmlns:wpg="http://schemas.microsoft.com/office/word/2010/wordprocessingGroup" xmlns:wpi="http://schemas.microsoft.com/office/word/2010/wordprocessingInk" xmlns:wne="http://schemas.microsoft.com/office/word/2006/wordml" xmlns:wps="http://schemas.microsoft.com/office/word/2010/wordprocessingShape" mc:Ignorable="w14 w15 w16se w16cid w16 w16cex w16sdtdh wp14">
+  <w:comment w:id="139" w:author="Tsao, Carolyn (ELC)" w:date="2025-12-11T21:00:00Z" w:initials="TC(">
+    <w:p>
+      <w:pPr>
+        <w:jc w:val="left"/>
+      </w:pPr>
+      <w:r>
+        <w:rPr>
+          <w:rStyle w:val="CommentReference"/>
+        </w:rPr>
+        <w:annotationRef/>
+      </w:r>
+      <w:r>
+        <w:rPr>
+          <w:sz w:val="20"/>
+          <w:szCs w:val="20"/>
+        </w:rPr>
+        <w:t>Wait, should we not say this anymore, given the updated language of the occupational score results above?</w:t>
+      </w:r>
+    </w:p>
+  </w:comment>
+</w:comments>
+</file>
+
+<file path=word/commentsExtended.xml><?xml version="1.0" encoding="utf-8"?>
+<w15:commentsEx xmlns:wpc="http://schemas.microsoft.com/office/word/2010/wordprocessingCanvas" xmlns:cx="http://schemas.microsoft.com/office/drawing/2014/chartex" xmlns:cx1="http://schemas.microsoft.com/office/drawing/2015/9/8/chartex" xmlns:cx2="http://schemas.microsoft.com/office/drawing/2015/10/21/chartex" xmlns:cx3="http://schemas.microsoft.com/office/drawing/2016/5/9/chartex" xmlns:cx4="http://schemas.microsoft.com/office/drawing/2016/5/10/chartex" xmlns:cx5="http://schemas.microsoft.com/office/drawing/2016/5/11/chartex" xmlns:cx6="http://schemas.microsoft.com/office/drawing/2016/5/12/chartex" xmlns:cx7="http://schemas.microsoft.com/office/drawing/2016/5/13/chartex" xmlns:cx8="http://schemas.microsoft.com/office/drawing/2016/5/14/chartex" xmlns:mc="http://schemas.openxmlformats.org/markup-compatibility/2006" xmlns:aink="http://schemas.microsoft.com/office/drawing/2016/ink" xmlns:am3d="http://schemas.microsoft.com/office/drawing/2017/model3d" xmlns:o="urn:schemas-microsoft-com:office:office" xmlns:oel="http://schemas.microsoft.com/office/2019/extlst" xmlns:r="http://schemas.openxmlformats.org/officeDocument/2006/relationships" xmlns:m="http://schemas.openxmlformats.org/officeDocument/2006/math" xmlns:v="urn:schemas-microsoft-com:vml" xmlns:wp14="http://schemas.microsoft.com/office/word/2010/wordprocessingDrawing" xmlns:wp="http://schemas.openxmlformats.org/drawingml/2006/wordprocessingDrawing" xmlns:w10="urn:schemas-microsoft-com:office:word" xmlns:w="http://schemas.openxmlformats.org/wordprocessingml/2006/main" xmlns:w14="http://schemas.microsoft.com/office/word/2010/wordml" xmlns:w15="http://schemas.microsoft.com/office/word/2012/wordml" xmlns:w16cex="http://schemas.microsoft.com/office/word/2018/wordml/cex" xmlns:w16cid="http://schemas.microsoft.com/office/word/2016/wordml/cid" xmlns:w16="http://schemas.microsoft.com/office/word/2018/wordml" xmlns:w16sdtdh="http://schemas.microsoft.com/office/word/2020/wordml/sdtdatahash" xmlns:w16se="http://schemas.microsoft.com/office/word/2015/wordml/symex" xmlns:wpg="http://schemas.microsoft.com/office/word/2010/wordprocessingGroup" xmlns:wpi="http://schemas.microsoft.com/office/word/2010/wordprocessingInk" xmlns:wne="http://schemas.microsoft.com/office/word/2006/wordml" xmlns:wps="http://schemas.microsoft.com/office/word/2010/wordprocessingShape" mc:Ignorable="w14 w15 w16se w16cid w16 w16cex w16sdtdh wp14">
+  <w15:commentEx w15:paraId="76756EB1" w15:done="0"/>
+</w15:commentsEx>
+</file>
+
+<file path=word/commentsExtensible.xml><?xml version="1.0" encoding="utf-8"?>
+<w16cex:commentsExtensible xmlns:wpc="http://schemas.microsoft.com/office/word/2010/wordprocessingCanvas" xmlns:cx="http://schemas.microsoft.com/office/drawing/2014/chartex" xmlns:cx1="http://schemas.microsoft.com/office/drawing/2015/9/8/chartex" xmlns:cx2="http://schemas.microsoft.com/office/drawing/2015/10/21/chartex" xmlns:cx3="http://schemas.microsoft.com/office/drawing/2016/5/9/chartex" xmlns:cx4="http://schemas.microsoft.com/office/drawing/2016/5/10/chartex" xmlns:cx5="http://schemas.microsoft.com/office/drawing/2016/5/11/chartex" xmlns:cx6="http://schemas.microsoft.com/office/drawing/2016/5/12/chartex" xmlns:cx7="http://schemas.microsoft.com/office/drawing/2016/5/13/chartex" xmlns:cx8="http://schemas.microsoft.com/office/drawing/2016/5/14/chartex" xmlns:mc="http://schemas.openxmlformats.org/markup-compatibility/2006" xmlns:aink="http://schemas.microsoft.com/office/drawing/2016/ink" xmlns:am3d="http://schemas.microsoft.com/office/drawing/2017/model3d" xmlns:o="urn:schemas-microsoft-com:office:office" xmlns:oel="http://schemas.microsoft.com/office/2019/extlst" xmlns:r="http://schemas.openxmlformats.org/officeDocument/2006/relationships" xmlns:m="http://schemas.openxmlformats.org/officeDocument/2006/math" xmlns:v="urn:schemas-microsoft-com:vml" xmlns:wp14="http://schemas.microsoft.com/office/word/2010/wordprocessingDrawing" xmlns:wp="http://schemas.openxmlformats.org/drawingml/2006/wordprocessingDrawing" xmlns:w10="urn:schemas-microsoft-com:office:word" xmlns:w="http://schemas.openxmlformats.org/wordprocessingml/2006/main" xmlns:w14="http://schemas.microsoft.com/office/word/2010/wordml" xmlns:w15="http://schemas.microsoft.com/office/word/2012/wordml" xmlns:w16cex="http://schemas.microsoft.com/office/word/2018/wordml/cex" xmlns:w16cid="http://schemas.microsoft.com/office/word/2016/wordml/cid" xmlns:w16="http://schemas.microsoft.com/office/word/2018/wordml" xmlns:w16sdtdh="http://schemas.microsoft.com/office/word/2020/wordml/sdtdatahash" xmlns:w16se="http://schemas.microsoft.com/office/word/2015/wordml/symex" xmlns:wpg="http://schemas.microsoft.com/office/word/2010/wordprocessingGroup" xmlns:wpi="http://schemas.microsoft.com/office/word/2010/wordprocessingInk" xmlns:wne="http://schemas.microsoft.com/office/word/2006/wordml" xmlns:wps="http://schemas.microsoft.com/office/word/2010/wordprocessingShape" mc:Ignorable="w14 w15 w16se w16cid w16 w16cex w16sdtdh wp14">
+  <w16cex:commentExtensible w16cex:durableId="3F422AE6" w16cex:dateUtc="2025-12-12T02:00:00Z"/>
+</w16cex:commentsExtensible>
+</file>
+
+<file path=word/commentsIds.xml><?xml version="1.0" encoding="utf-8"?>
+<w16cid:commentsIds xmlns:wpc="http://schemas.microsoft.com/office/word/2010/wordprocessingCanvas" xmlns:cx="http://schemas.microsoft.com/office/drawing/2014/chartex" xmlns:cx1="http://schemas.microsoft.com/office/drawing/2015/9/8/chartex" xmlns:cx2="http://schemas.microsoft.com/office/drawing/2015/10/21/chartex" xmlns:cx3="http://schemas.microsoft.com/office/drawing/2016/5/9/chartex" xmlns:cx4="http://schemas.microsoft.com/office/drawing/2016/5/10/chartex" xmlns:cx5="http://schemas.microsoft.com/office/drawing/2016/5/11/chartex" xmlns:cx6="http://schemas.microsoft.com/office/drawing/2016/5/12/chartex" xmlns:cx7="http://schemas.microsoft.com/office/drawing/2016/5/13/chartex" xmlns:cx8="http://schemas.microsoft.com/office/drawing/2016/5/14/chartex" xmlns:mc="http://schemas.openxmlformats.org/markup-compatibility/2006" xmlns:aink="http://schemas.microsoft.com/office/drawing/2016/ink" xmlns:am3d="http://schemas.microsoft.com/office/drawing/2017/model3d" xmlns:o="urn:schemas-microsoft-com:office:office" xmlns:oel="http://schemas.microsoft.com/office/2019/extlst" xmlns:r="http://schemas.openxmlformats.org/officeDocument/2006/relationships" xmlns:m="http://schemas.openxmlformats.org/officeDocument/2006/math" xmlns:v="urn:schemas-microsoft-com:vml" xmlns:wp14="http://schemas.microsoft.com/office/word/2010/wordprocessingDrawing" xmlns:wp="http://schemas.openxmlformats.org/drawingml/2006/wordprocessingDrawing" xmlns:w10="urn:schemas-microsoft-com:office:word" xmlns:w="http://schemas.openxmlformats.org/wordprocessingml/2006/main" xmlns:w14="http://schemas.microsoft.com/office/word/2010/wordml" xmlns:w15="http://schemas.microsoft.com/office/word/2012/wordml" xmlns:w16cex="http://schemas.microsoft.com/office/word/2018/wordml/cex" xmlns:w16cid="http://schemas.microsoft.com/office/word/2016/wordml/cid" xmlns:w16="http://schemas.microsoft.com/office/word/2018/wordml" xmlns:w16sdtdh="http://schemas.microsoft.com/office/word/2020/wordml/sdtdatahash" xmlns:w16se="http://schemas.microsoft.com/office/word/2015/wordml/symex" xmlns:wpg="http://schemas.microsoft.com/office/word/2010/wordprocessingGroup" xmlns:wpi="http://schemas.microsoft.com/office/word/2010/wordprocessingInk" xmlns:wne="http://schemas.microsoft.com/office/word/2006/wordml" xmlns:wps="http://schemas.microsoft.com/office/word/2010/wordprocessingShape" mc:Ignorable="w14 w15 w16se w16cid w16 w16cex w16sdtdh wp14">
+  <w16cid:commentId w16cid:paraId="76756EB1" w16cid:durableId="3F422AE6"/>
+</w16cid:commentsIds>
 </file>
 
 <file path=word/endnotes.xml><?xml version="1.0" encoding="utf-8"?>
@@ -24777,11 +25826,11 @@
         <w:spacing w:line="420" w:lineRule="auto"/>
         <w:ind w:firstLine="274"/>
         <w:rPr>
-          <w:del w:id="22" w:author="Amy Kim" w:date="2025-12-11T14:57:00Z"/>
-          <w:rFonts w:ascii="Times New Roman" w:hAnsi="Times New Roman" w:cs="Times New Roman"/>
-        </w:rPr>
-      </w:pPr>
-      <w:del w:id="23" w:author="Amy Kim" w:date="2025-12-11T14:57:00Z">
+          <w:del w:id="23" w:author="Amy Kim" w:date="2025-12-11T14:57:00Z"/>
+          <w:rFonts w:ascii="Times New Roman" w:hAnsi="Times New Roman" w:cs="Times New Roman"/>
+        </w:rPr>
+      </w:pPr>
+      <w:del w:id="24" w:author="Amy Kim" w:date="2025-12-11T14:57:00Z">
         <w:r>
           <w:rPr>
             <w:rStyle w:val="footnotemark"/>
@@ -25079,37 +26128,51 @@
   <w:footnote w:id="12">
     <w:p>
       <w:pPr>
-        <w:pStyle w:val="footnotedescription"/>
-        <w:rPr>
-          <w:rFonts w:ascii="Times New Roman" w:hAnsi="Times New Roman" w:cs="Times New Roman"/>
-        </w:rPr>
-      </w:pPr>
-      <w:r>
-        <w:rPr>
-          <w:rStyle w:val="footnotemark"/>
-          <w:rFonts w:ascii="Times New Roman" w:hAnsi="Times New Roman" w:cs="Times New Roman"/>
-        </w:rPr>
-        <w:footnoteRef/>
-      </w:r>
-      <w:r>
-        <w:rPr>
-          <w:rFonts w:ascii="Times New Roman" w:hAnsi="Times New Roman" w:cs="Times New Roman"/>
-        </w:rPr>
-        <w:t xml:space="preserve"> These statistics also highlight that our findings are most relevant for the U.S. South. The higher studentteacher ratios in particular in Southern states are consistent with anecdotal evidence of teacher shortages in the South, as in Goldin (</w:t>
-      </w:r>
-      <w:r>
-        <w:rPr>
-          <w:rFonts w:ascii="Times New Roman" w:hAnsi="Times New Roman" w:cs="Times New Roman"/>
-          <w:color w:val="0000FF"/>
-        </w:rPr>
-        <w:t>2021</w:t>
-      </w:r>
-      <w:r>
-        <w:rPr>
-          <w:rFonts w:ascii="Times New Roman" w:hAnsi="Times New Roman" w:cs="Times New Roman"/>
-        </w:rPr>
-        <w:t>).</w:t>
-      </w:r>
+        <w:pStyle w:val="FootnoteText"/>
+        <w:rPr>
+          <w:ins w:id="49" w:author="Tsao, Carolyn (ELC)" w:date="2025-12-11T20:46:00Z"/>
+          <w:lang w:val="en-CA"/>
+        </w:rPr>
+      </w:pPr>
+      <w:ins w:id="50" w:author="Tsao, Carolyn (ELC)" w:date="2025-12-11T20:46:00Z">
+        <w:r>
+          <w:rPr>
+            <w:rStyle w:val="FootnoteReference"/>
+          </w:rPr>
+          <w:footnoteRef/>
+        </w:r>
+        <w:r>
+          <w:t xml:space="preserve"> </w:t>
+        </w:r>
+        <w:r>
+          <w:rPr>
+            <w:rFonts w:ascii="Times New Roman" w:hAnsi="Times New Roman" w:cs="Times New Roman"/>
+          </w:rPr>
+          <w:t xml:space="preserve">Linkage rates are provided in Online Appendix </w:t>
+        </w:r>
+        <w:r>
+          <w:rPr>
+            <w:rFonts w:ascii="Times New Roman" w:hAnsi="Times New Roman" w:cs="Times New Roman"/>
+          </w:rPr>
+          <w:t xml:space="preserve">Table B1, and discussed further in Online Appendix </w:t>
+        </w:r>
+      </w:ins>
+      <w:ins w:id="51" w:author="Tsao, Carolyn (ELC)" w:date="2025-12-11T20:49:00Z">
+        <w:r>
+          <w:rPr>
+            <w:rFonts w:ascii="Times New Roman" w:hAnsi="Times New Roman" w:cs="Times New Roman"/>
+          </w:rPr>
+          <w:t>E</w:t>
+        </w:r>
+      </w:ins>
+      <w:ins w:id="52" w:author="Tsao, Carolyn (ELC)" w:date="2025-12-11T20:46:00Z">
+        <w:r>
+          <w:rPr>
+            <w:rFonts w:ascii="Times New Roman" w:hAnsi="Times New Roman" w:cs="Times New Roman"/>
+          </w:rPr>
+          <w:t xml:space="preserve">. </w:t>
+        </w:r>
+      </w:ins>
     </w:p>
   </w:footnote>
   <w:footnote w:id="13">
@@ -25131,7 +26194,34 @@
         <w:rPr>
           <w:rFonts w:ascii="Times New Roman" w:hAnsi="Times New Roman" w:cs="Times New Roman"/>
         </w:rPr>
-        <w:t xml:space="preserve"> We exclude 13 counties that are either created or consolidated between 1910 and 1950 and are thus missing from the Census in at least one year. See Panel (a) of Online Appendix Figure C1 for a map of our sample of treated and control counties.</w:t>
+        <w:t xml:space="preserve"> These statistics also highlight that our findings are most relevant for the U.S. South. The higher student</w:t>
+      </w:r>
+      <w:ins w:id="103" w:author="Amy Kim" w:date="2025-12-12T14:22:00Z">
+        <w:r>
+          <w:rPr>
+            <w:rFonts w:ascii="Times New Roman" w:hAnsi="Times New Roman" w:cs="Times New Roman"/>
+          </w:rPr>
+          <w:t>-</w:t>
+        </w:r>
+      </w:ins>
+      <w:r>
+        <w:rPr>
+          <w:rFonts w:ascii="Times New Roman" w:hAnsi="Times New Roman" w:cs="Times New Roman"/>
+        </w:rPr>
+        <w:t>teacher ratios in particular in Southern states are consistent with anecdotal evidence of teacher shortages in the South, as in Goldin (</w:t>
+      </w:r>
+      <w:r>
+        <w:rPr>
+          <w:rFonts w:ascii="Times New Roman" w:hAnsi="Times New Roman" w:cs="Times New Roman"/>
+          <w:color w:val="0000FF"/>
+        </w:rPr>
+        <w:t>2021</w:t>
+      </w:r>
+      <w:r>
+        <w:rPr>
+          <w:rFonts w:ascii="Times New Roman" w:hAnsi="Times New Roman" w:cs="Times New Roman"/>
+        </w:rPr>
+        <w:t>).</w:t>
       </w:r>
     </w:p>
   </w:footnote>
@@ -25139,7 +26229,6 @@
     <w:p>
       <w:pPr>
         <w:pStyle w:val="footnotedescription"/>
-        <w:spacing w:line="268" w:lineRule="auto"/>
         <w:rPr>
           <w:rFonts w:ascii="Times New Roman" w:hAnsi="Times New Roman" w:cs="Times New Roman"/>
         </w:rPr>
@@ -25155,33 +26244,7 @@
         <w:rPr>
           <w:rFonts w:ascii="Times New Roman" w:hAnsi="Times New Roman" w:cs="Times New Roman"/>
         </w:rPr>
-        <w:t xml:space="preserve"> Although treatment timing is staggered in our setting (1933 for NC and 1938 for KY), implementing the estimators recommended in the recent literature on difference-in-differences for such environments (Roth et al. </w:t>
-      </w:r>
-      <w:r>
-        <w:rPr>
-          <w:rFonts w:ascii="Times New Roman" w:hAnsi="Times New Roman" w:cs="Times New Roman"/>
-          <w:color w:val="0000FF"/>
-        </w:rPr>
-        <w:t>2023</w:t>
-      </w:r>
-      <w:r>
-        <w:rPr>
-          <w:rFonts w:ascii="Times New Roman" w:hAnsi="Times New Roman" w:cs="Times New Roman"/>
-        </w:rPr>
-        <w:t xml:space="preserve">; Sun and Abraham </w:t>
-      </w:r>
-      <w:r>
-        <w:rPr>
-          <w:rFonts w:ascii="Times New Roman" w:hAnsi="Times New Roman" w:cs="Times New Roman"/>
-          <w:color w:val="0000FF"/>
-        </w:rPr>
-        <w:t>2021</w:t>
-      </w:r>
-      <w:r>
-        <w:rPr>
-          <w:rFonts w:ascii="Times New Roman" w:hAnsi="Times New Roman" w:cs="Times New Roman"/>
-        </w:rPr>
-        <w:t>) requires more frequent observations (for example, yearly) before and after treatment than our data contain.</w:t>
+        <w:t xml:space="preserve"> We exclude 13 counties that are either created or consolidated between 1910 and 1950 and are thus missing from the Census in at least one year. See Panel (a) of Online Appendix Figure C1 for a map of our sample of treated and control counties.</w:t>
       </w:r>
     </w:p>
   </w:footnote>
@@ -25189,6 +26252,7 @@
     <w:p>
       <w:pPr>
         <w:pStyle w:val="footnotedescription"/>
+        <w:spacing w:line="268" w:lineRule="auto"/>
         <w:rPr>
           <w:rFonts w:ascii="Times New Roman" w:hAnsi="Times New Roman" w:cs="Times New Roman"/>
         </w:rPr>
@@ -25204,7 +26268,33 @@
         <w:rPr>
           <w:rFonts w:ascii="Times New Roman" w:hAnsi="Times New Roman" w:cs="Times New Roman"/>
         </w:rPr>
-        <w:t xml:space="preserve"> In our state-level analysis in Online Appendix D we also show results for NC and KY separately. Our findings are not being disproportionately driven by one state; in fact, point estimates are remarkably similar for both states.</w:t>
+        <w:t xml:space="preserve"> Although treatment timing is staggered in our setting (1933 for NC and 1938 for KY), implementing the estimators recommended in the recent literature on difference-in-differences for such environments (Roth et al. </w:t>
+      </w:r>
+      <w:r>
+        <w:rPr>
+          <w:rFonts w:ascii="Times New Roman" w:hAnsi="Times New Roman" w:cs="Times New Roman"/>
+          <w:color w:val="0000FF"/>
+        </w:rPr>
+        <w:t>2023</w:t>
+      </w:r>
+      <w:r>
+        <w:rPr>
+          <w:rFonts w:ascii="Times New Roman" w:hAnsi="Times New Roman" w:cs="Times New Roman"/>
+        </w:rPr>
+        <w:t xml:space="preserve">; Sun and Abraham </w:t>
+      </w:r>
+      <w:r>
+        <w:rPr>
+          <w:rFonts w:ascii="Times New Roman" w:hAnsi="Times New Roman" w:cs="Times New Roman"/>
+          <w:color w:val="0000FF"/>
+        </w:rPr>
+        <w:t>2021</w:t>
+      </w:r>
+      <w:r>
+        <w:rPr>
+          <w:rFonts w:ascii="Times New Roman" w:hAnsi="Times New Roman" w:cs="Times New Roman"/>
+        </w:rPr>
+        <w:t>) requires more frequent observations (for example, yearly) before and after treatment than our data contain.</w:t>
       </w:r>
     </w:p>
   </w:footnote>
@@ -25227,7 +26317,7 @@
         <w:rPr>
           <w:rFonts w:ascii="Times New Roman" w:hAnsi="Times New Roman" w:cs="Times New Roman"/>
         </w:rPr>
-        <w:t xml:space="preserve"> We include 1910 in our main specification in order to show difference-in-differences estimates for as long a pre-period as possible. The results do not change when we exclude 1910 and focus on the balanced panel of years around the prohibition of the marriage bars.</w:t>
+        <w:t xml:space="preserve"> In our state-level analysis in Online Appendix D we also show results for NC and KY separately. Our findings are not being disproportionately driven by one state; in fact, point estimates are remarkably similar for both states.</w:t>
       </w:r>
     </w:p>
   </w:footnote>
@@ -25235,7 +26325,9 @@
     <w:p>
       <w:pPr>
         <w:pStyle w:val="footnotedescription"/>
-        <w:spacing w:line="252" w:lineRule="auto"/>
+        <w:rPr>
+          <w:rFonts w:ascii="Times New Roman" w:hAnsi="Times New Roman" w:cs="Times New Roman"/>
+        </w:rPr>
       </w:pPr>
       <w:r>
         <w:rPr>
@@ -25248,33 +26340,7 @@
         <w:rPr>
           <w:rFonts w:ascii="Times New Roman" w:hAnsi="Times New Roman" w:cs="Times New Roman"/>
         </w:rPr>
-        <w:t xml:space="preserve"> Our preferred specification uses county level clustering for two reasons. First, we observe significant heterogeneity across counties within state in terms of their baseline level of employment of married women prior to the prohibitions. As such, although the prohibitions were technically applied to whole states at once, there is reason to believe that within-county correlations over time may be more relevant for our outcomes of interest than across-county, within-state correlations over time. Second, there is an insufficiently small number of states in our setting (six in total) for standard inference using clustering at the state level to be valid, and solutions to few clusters typically require strong homogeneity assumptions (Canay, Santos, and Shaikh </w:t>
-      </w:r>
-      <w:r>
-        <w:rPr>
-          <w:rFonts w:ascii="Times New Roman" w:hAnsi="Times New Roman" w:cs="Times New Roman"/>
-          <w:color w:val="0000FF"/>
-        </w:rPr>
-        <w:t>2021</w:t>
-      </w:r>
-      <w:r>
-        <w:rPr>
-          <w:rFonts w:ascii="Times New Roman" w:hAnsi="Times New Roman" w:cs="Times New Roman"/>
-        </w:rPr>
-        <w:t xml:space="preserve">; Roth et al. </w:t>
-      </w:r>
-      <w:r>
-        <w:rPr>
-          <w:rFonts w:ascii="Times New Roman" w:hAnsi="Times New Roman" w:cs="Times New Roman"/>
-          <w:color w:val="0000FF"/>
-        </w:rPr>
-        <w:t>2023</w:t>
-      </w:r>
-      <w:r>
-        <w:rPr>
-          <w:rFonts w:ascii="Times New Roman" w:hAnsi="Times New Roman" w:cs="Times New Roman"/>
-        </w:rPr>
-        <w:t>). Regardless, in Online Appendix Figure A4, we show standard errors clustered at the state level using the cluster wild bootstrap. We also use a state-level synthetic difference-in-differences empirical strategy in Online Appendix D. Our main results are robust to both approaches.</w:t>
+        <w:t xml:space="preserve"> We include 1910 in our main specification in order to show difference-in-differences estimates for as long a pre-period as possible. The results do not change when we exclude 1910 and focus on the balanced panel of years around the prohibition of the marriage bars.</w:t>
       </w:r>
     </w:p>
   </w:footnote>
@@ -25282,9 +26348,7 @@
     <w:p>
       <w:pPr>
         <w:pStyle w:val="footnotedescription"/>
-        <w:rPr>
-          <w:rFonts w:ascii="Times New Roman" w:hAnsi="Times New Roman" w:cs="Times New Roman"/>
-        </w:rPr>
+        <w:spacing w:line="252" w:lineRule="auto"/>
       </w:pPr>
       <w:r>
         <w:rPr>
@@ -25297,7 +26361,33 @@
         <w:rPr>
           <w:rFonts w:ascii="Times New Roman" w:hAnsi="Times New Roman" w:cs="Times New Roman"/>
         </w:rPr>
-        <w:t xml:space="preserve"> Another natural outcome of interest is women’s age at marriage. However, age at marriage was only collected for sample-line individuals (roughly 5% of the population) in the 1940 census, resulting in too few teachers with age at marriage recorded to be able to capture meaningful variation for our purposes.</w:t>
+        <w:t xml:space="preserve"> Our preferred specification uses county level clustering for two reasons. First, we observe significant heterogeneity across counties within state in terms of their baseline level of employment of married women prior to the prohibitions. As such, although the prohibitions were technically applied to whole states at once, there is reason to believe that within-county correlations over time may be more relevant for our outcomes of interest than across-county, within-state correlations over time. Second, there is an insufficiently small number of states in our setting (six in total) for standard inference using clustering at the state level to be valid, and solutions to few clusters typically require strong homogeneity assumptions (Canay, Santos, and Shaikh </w:t>
+      </w:r>
+      <w:r>
+        <w:rPr>
+          <w:rFonts w:ascii="Times New Roman" w:hAnsi="Times New Roman" w:cs="Times New Roman"/>
+          <w:color w:val="0000FF"/>
+        </w:rPr>
+        <w:t>2021</w:t>
+      </w:r>
+      <w:r>
+        <w:rPr>
+          <w:rFonts w:ascii="Times New Roman" w:hAnsi="Times New Roman" w:cs="Times New Roman"/>
+        </w:rPr>
+        <w:t xml:space="preserve">; Roth et al. </w:t>
+      </w:r>
+      <w:r>
+        <w:rPr>
+          <w:rFonts w:ascii="Times New Roman" w:hAnsi="Times New Roman" w:cs="Times New Roman"/>
+          <w:color w:val="0000FF"/>
+        </w:rPr>
+        <w:t>2023</w:t>
+      </w:r>
+      <w:r>
+        <w:rPr>
+          <w:rFonts w:ascii="Times New Roman" w:hAnsi="Times New Roman" w:cs="Times New Roman"/>
+        </w:rPr>
+        <w:t>). Regardless, in Online Appendix Figure A4, we show standard errors clustered at the state level using the cluster wild bootstrap. We also use a state-level synthetic difference-in-differences empirical strategy in Online Appendix D. Our main results are robust to both approaches.</w:t>
       </w:r>
     </w:p>
   </w:footnote>
@@ -25305,7 +26395,6 @@
     <w:p>
       <w:pPr>
         <w:pStyle w:val="footnotedescription"/>
-        <w:spacing w:line="257" w:lineRule="auto"/>
         <w:rPr>
           <w:rFonts w:ascii="Times New Roman" w:hAnsi="Times New Roman" w:cs="Times New Roman"/>
         </w:rPr>
@@ -25321,7 +26410,7 @@
         <w:rPr>
           <w:rFonts w:ascii="Times New Roman" w:hAnsi="Times New Roman" w:cs="Times New Roman"/>
         </w:rPr>
-        <w:t xml:space="preserve"> Since this survey took place several years after marriage bars in teaching were prohibited in NC, we do not compare the responses from NC. Note also that 1938 was the same year that marriage bars in teaching were prohibited in KY, which could bias the results if conversations around the policy change were salient for the average person. These results should therefore be interpreted with caution.</w:t>
+        <w:t xml:space="preserve"> Another natural outcome of interest is women’s age at marriage. However, age at marriage was only collected for sample-line individuals (roughly 5% of the population) in the 1940 census, resulting in too few teachers with age at marriage recorded to be able to capture meaningful variation for our purposes.</w:t>
       </w:r>
     </w:p>
   </w:footnote>
@@ -25329,6 +26418,7 @@
     <w:p>
       <w:pPr>
         <w:pStyle w:val="footnotedescription"/>
+        <w:spacing w:line="257" w:lineRule="auto"/>
         <w:rPr>
           <w:rFonts w:ascii="Times New Roman" w:hAnsi="Times New Roman" w:cs="Times New Roman"/>
         </w:rPr>
@@ -25344,7 +26434,7 @@
         <w:rPr>
           <w:rFonts w:ascii="Times New Roman" w:hAnsi="Times New Roman" w:cs="Times New Roman"/>
         </w:rPr>
-        <w:t xml:space="preserve"> The only change that occurred was that Virginia, one of our control states, required one more year of compulsory schooling in the 1920s, which would have led to increased demand for teachers and bias our estimates downwards.</w:t>
+        <w:t xml:space="preserve"> Since this survey took place several years after marriage bars in teaching were prohibited in NC, we do not compare the responses from NC. Note also that 1938 was the same year that marriage bars in teaching were prohibited in KY, which could bias the results if conversations around the policy change were salient for the average person. These results should therefore be interpreted with caution.</w:t>
       </w:r>
     </w:p>
   </w:footnote>
@@ -25352,7 +26442,9 @@
     <w:p>
       <w:pPr>
         <w:pStyle w:val="footnotedescription"/>
-        <w:spacing w:line="257" w:lineRule="auto"/>
+        <w:rPr>
+          <w:rFonts w:ascii="Times New Roman" w:hAnsi="Times New Roman" w:cs="Times New Roman"/>
+        </w:rPr>
       </w:pPr>
       <w:r>
         <w:rPr>
@@ -25365,7 +26457,7 @@
         <w:rPr>
           <w:rFonts w:ascii="Times New Roman" w:hAnsi="Times New Roman" w:cs="Times New Roman"/>
         </w:rPr>
-        <w:t xml:space="preserve"> There are data on New Deal spending by county from 1933 to 1939, but given the time period and decennial nature of the census, the data cannot be used to construct time-varying measures of New Deal spending in 1930 and 1940. We proxy for both recession severity and economic recovery using changes in retail sales per capita instead.</w:t>
+        <w:t xml:space="preserve"> The only change that occurred was that Virginia, one of our control states, required one more year of compulsory schooling in the 1920s, which would have led to increased demand for teachers and bias our estimates downwards.</w:t>
       </w:r>
     </w:p>
   </w:footnote>
@@ -25373,10 +26465,7 @@
     <w:p>
       <w:pPr>
         <w:pStyle w:val="footnotedescription"/>
-        <w:spacing w:line="293" w:lineRule="auto"/>
-        <w:rPr>
-          <w:rFonts w:ascii="Times New Roman" w:hAnsi="Times New Roman" w:cs="Times New Roman"/>
-        </w:rPr>
+        <w:spacing w:line="257" w:lineRule="auto"/>
       </w:pPr>
       <w:r>
         <w:rPr>
@@ -25389,33 +26478,7 @@
         <w:rPr>
           <w:rFonts w:ascii="Times New Roman" w:hAnsi="Times New Roman" w:cs="Times New Roman"/>
         </w:rPr>
-        <w:t xml:space="preserve"> Similarly, while prior work finds that birthrates decreased during the Great Depression (Schaller, Fishback, and Marquardt </w:t>
-      </w:r>
-      <w:r>
-        <w:rPr>
-          <w:rFonts w:ascii="Times New Roman" w:hAnsi="Times New Roman" w:cs="Times New Roman"/>
-          <w:color w:val="0000FF"/>
-        </w:rPr>
-        <w:t>2020</w:t>
-      </w:r>
-      <w:r>
-        <w:rPr>
-          <w:rFonts w:ascii="Times New Roman" w:hAnsi="Times New Roman" w:cs="Times New Roman"/>
-        </w:rPr>
-        <w:t xml:space="preserve">), the New Deal countered these effects by decreasing infant mortality and increasing birthrates (Fishback, Haines, and Kantor </w:t>
-      </w:r>
-      <w:r>
-        <w:rPr>
-          <w:rFonts w:ascii="Times New Roman" w:hAnsi="Times New Roman" w:cs="Times New Roman"/>
-          <w:color w:val="0000FF"/>
-        </w:rPr>
-        <w:t>2007</w:t>
-      </w:r>
-      <w:r>
-        <w:rPr>
-          <w:rFonts w:ascii="Times New Roman" w:hAnsi="Times New Roman" w:cs="Times New Roman"/>
-        </w:rPr>
-        <w:t>).</w:t>
+        <w:t xml:space="preserve"> There are data on New Deal spending by county from 1933 to 1939, but given the time period and decennial nature of the census, the data cannot be used to construct time-varying measures of New Deal spending in 1930 and 1940. We proxy for both recession severity and economic recovery using changes in retail sales per capita instead.</w:t>
       </w:r>
     </w:p>
   </w:footnote>
@@ -25423,7 +26486,7 @@
     <w:p>
       <w:pPr>
         <w:pStyle w:val="footnotedescription"/>
-        <w:spacing w:line="252" w:lineRule="auto"/>
+        <w:spacing w:line="293" w:lineRule="auto"/>
         <w:rPr>
           <w:rFonts w:ascii="Times New Roman" w:hAnsi="Times New Roman" w:cs="Times New Roman"/>
         </w:rPr>
@@ -25439,20 +26502,33 @@
         <w:rPr>
           <w:rFonts w:ascii="Times New Roman" w:hAnsi="Times New Roman" w:cs="Times New Roman"/>
         </w:rPr>
-        <w:t xml:space="preserve"> Note that sample sizes differ across columns of Table </w:t>
+        <w:t xml:space="preserve"> Similarly, while prior work finds that birthrates decreased during the Great Depression (Schaller, Fishback, and Marquardt </w:t>
       </w:r>
       <w:r>
         <w:rPr>
           <w:rFonts w:ascii="Times New Roman" w:hAnsi="Times New Roman" w:cs="Times New Roman"/>
           <w:color w:val="0000FF"/>
         </w:rPr>
-        <w:t xml:space="preserve">2 </w:t>
-      </w:r>
-      <w:r>
-        <w:rPr>
-          <w:rFonts w:ascii="Times New Roman" w:hAnsi="Times New Roman" w:cs="Times New Roman"/>
-        </w:rPr>
-        <w:t>due to our sample construction as discussed in the County Sample Selection section. However, our results are not dependent on the sample: Column (3) of Online Appendix Table B3 shows that our results for all teachers are robust even when using the restricted set of counties we use to study Black teachers.</w:t>
+        <w:t>2020</w:t>
+      </w:r>
+      <w:r>
+        <w:rPr>
+          <w:rFonts w:ascii="Times New Roman" w:hAnsi="Times New Roman" w:cs="Times New Roman"/>
+        </w:rPr>
+        <w:t xml:space="preserve">), the New Deal countered these effects by decreasing infant mortality and increasing birthrates (Fishback, Haines, and Kantor </w:t>
+      </w:r>
+      <w:r>
+        <w:rPr>
+          <w:rFonts w:ascii="Times New Roman" w:hAnsi="Times New Roman" w:cs="Times New Roman"/>
+          <w:color w:val="0000FF"/>
+        </w:rPr>
+        <w:t>2007</w:t>
+      </w:r>
+      <w:r>
+        <w:rPr>
+          <w:rFonts w:ascii="Times New Roman" w:hAnsi="Times New Roman" w:cs="Times New Roman"/>
+        </w:rPr>
+        <w:t>).</w:t>
       </w:r>
     </w:p>
   </w:footnote>
@@ -25460,7 +26536,7 @@
     <w:p>
       <w:pPr>
         <w:pStyle w:val="footnotedescription"/>
-        <w:spacing w:line="271" w:lineRule="auto"/>
+        <w:spacing w:line="252" w:lineRule="auto"/>
         <w:rPr>
           <w:rFonts w:ascii="Times New Roman" w:hAnsi="Times New Roman" w:cs="Times New Roman"/>
         </w:rPr>
@@ -25476,37 +26552,88 @@
         <w:rPr>
           <w:rFonts w:ascii="Times New Roman" w:hAnsi="Times New Roman" w:cs="Times New Roman"/>
         </w:rPr>
-        <w:t xml:space="preserve"> In addition, in Online Appendix Table B4, we examine outcomes for other working women. We restrict our linked samples of unmarried women to be between the ages of 8 and 40 (16-40 for teachers) in </w:t>
-      </w:r>
-      <w:r>
-        <w:rPr>
-          <w:rFonts w:ascii="Times New Roman" w:hAnsi="Times New Roman" w:cs="Times New Roman"/>
-          <w:i/>
-        </w:rPr>
-        <w:t>t</w:t>
-      </w:r>
-      <w:r>
-        <w:rPr>
-          <w:rFonts w:ascii="Times New Roman" w:hAnsi="Times New Roman" w:cs="Times New Roman"/>
-        </w:rPr>
-        <w:t xml:space="preserve">−10, and we restrict our linked samples of married women to be between the ages of 18 and 50 in </w:t>
-      </w:r>
-      <w:r>
-        <w:rPr>
-          <w:rFonts w:ascii="Times New Roman" w:hAnsi="Times New Roman" w:cs="Times New Roman"/>
-          <w:i/>
-        </w:rPr>
-        <w:t xml:space="preserve">t </w:t>
-      </w:r>
-      <w:r>
-        <w:rPr>
-          <w:rFonts w:ascii="Times New Roman" w:hAnsi="Times New Roman" w:cs="Times New Roman"/>
-        </w:rPr>
-        <w:t>− 10, to focus on the populations for whom the decisions to marry and work were the most relevant. Our results are robust to alternate cutoffs.</w:t>
+        <w:t xml:space="preserve"> Note that sample sizes differ across columns of Table </w:t>
+      </w:r>
+      <w:r>
+        <w:rPr>
+          <w:rFonts w:ascii="Times New Roman" w:hAnsi="Times New Roman" w:cs="Times New Roman"/>
+          <w:color w:val="0000FF"/>
+        </w:rPr>
+        <w:t xml:space="preserve">2 </w:t>
+      </w:r>
+      <w:r>
+        <w:rPr>
+          <w:rFonts w:ascii="Times New Roman" w:hAnsi="Times New Roman" w:cs="Times New Roman"/>
+        </w:rPr>
+        <w:t xml:space="preserve">due to our sample construction as discussed in the County Sample Selection section. However, our results are not dependent on the sample: Column (3) of Online Appendix Table B3 shows that our results for all teachers are robust even when using the restricted set of </w:t>
+      </w:r>
+      <w:proofErr w:type="gramStart"/>
+      <w:r>
+        <w:rPr>
+          <w:rFonts w:ascii="Times New Roman" w:hAnsi="Times New Roman" w:cs="Times New Roman"/>
+        </w:rPr>
+        <w:t>counties</w:t>
+      </w:r>
+      <w:proofErr w:type="gramEnd"/>
+      <w:r>
+        <w:rPr>
+          <w:rFonts w:ascii="Times New Roman" w:hAnsi="Times New Roman" w:cs="Times New Roman"/>
+        </w:rPr>
+        <w:t xml:space="preserve"> we use to study Black teachers.</w:t>
       </w:r>
     </w:p>
   </w:footnote>
   <w:footnote w:id="25">
+    <w:p>
+      <w:pPr>
+        <w:pStyle w:val="footnotedescription"/>
+        <w:spacing w:line="271" w:lineRule="auto"/>
+        <w:rPr>
+          <w:rFonts w:ascii="Times New Roman" w:hAnsi="Times New Roman" w:cs="Times New Roman"/>
+        </w:rPr>
+      </w:pPr>
+      <w:r>
+        <w:rPr>
+          <w:rStyle w:val="footnotemark"/>
+          <w:rFonts w:ascii="Times New Roman" w:hAnsi="Times New Roman" w:cs="Times New Roman"/>
+        </w:rPr>
+        <w:footnoteRef/>
+      </w:r>
+      <w:r>
+        <w:rPr>
+          <w:rFonts w:ascii="Times New Roman" w:hAnsi="Times New Roman" w:cs="Times New Roman"/>
+        </w:rPr>
+        <w:t xml:space="preserve"> In addition, in Online Appendix Table B4, we examine outcomes for other working women. We restrict our linked samples of unmarried women to be between the ages of 8 and 40 (16-40 for teachers) in </w:t>
+      </w:r>
+      <w:r>
+        <w:rPr>
+          <w:rFonts w:ascii="Times New Roman" w:hAnsi="Times New Roman" w:cs="Times New Roman"/>
+          <w:i/>
+        </w:rPr>
+        <w:t>t</w:t>
+      </w:r>
+      <w:r>
+        <w:rPr>
+          <w:rFonts w:ascii="Times New Roman" w:hAnsi="Times New Roman" w:cs="Times New Roman"/>
+        </w:rPr>
+        <w:t xml:space="preserve">−10, and we restrict our linked samples of married women to be between the ages of 18 and 50 in </w:t>
+      </w:r>
+      <w:r>
+        <w:rPr>
+          <w:rFonts w:ascii="Times New Roman" w:hAnsi="Times New Roman" w:cs="Times New Roman"/>
+          <w:i/>
+        </w:rPr>
+        <w:t xml:space="preserve">t </w:t>
+      </w:r>
+      <w:r>
+        <w:rPr>
+          <w:rFonts w:ascii="Times New Roman" w:hAnsi="Times New Roman" w:cs="Times New Roman"/>
+        </w:rPr>
+        <w:t>− 10, to focus on the populations for whom the decisions to marry and work were the most relevant. Our results are robust to alternate cutoffs.</w:t>
+      </w:r>
+    </w:p>
+  </w:footnote>
+  <w:footnote w:id="26">
     <w:p>
       <w:pPr>
         <w:pStyle w:val="footnotedescription"/>
@@ -25557,7 +26684,7 @@
       </w:r>
     </w:p>
   </w:footnote>
-  <w:footnote w:id="26">
+  <w:footnote w:id="27">
     <w:p>
       <w:pPr>
         <w:pStyle w:val="footnotedescription"/>
@@ -25639,7 +26766,7 @@
       </w:r>
     </w:p>
   </w:footnote>
-  <w:footnote w:id="27">
+  <w:footnote w:id="28">
     <w:p>
       <w:pPr>
         <w:spacing w:after="6" w:line="257" w:lineRule="auto"/>
@@ -26020,6 +27147,9 @@
 <w15:people xmlns:wpc="http://schemas.microsoft.com/office/word/2010/wordprocessingCanvas" xmlns:cx="http://schemas.microsoft.com/office/drawing/2014/chartex" xmlns:cx1="http://schemas.microsoft.com/office/drawing/2015/9/8/chartex" xmlns:cx2="http://schemas.microsoft.com/office/drawing/2015/10/21/chartex" xmlns:cx3="http://schemas.microsoft.com/office/drawing/2016/5/9/chartex" xmlns:cx4="http://schemas.microsoft.com/office/drawing/2016/5/10/chartex" xmlns:cx5="http://schemas.microsoft.com/office/drawing/2016/5/11/chartex" xmlns:cx6="http://schemas.microsoft.com/office/drawing/2016/5/12/chartex" xmlns:cx7="http://schemas.microsoft.com/office/drawing/2016/5/13/chartex" xmlns:cx8="http://schemas.microsoft.com/office/drawing/2016/5/14/chartex" xmlns:mc="http://schemas.openxmlformats.org/markup-compatibility/2006" xmlns:aink="http://schemas.microsoft.com/office/drawing/2016/ink" xmlns:am3d="http://schemas.microsoft.com/office/drawing/2017/model3d" xmlns:o="urn:schemas-microsoft-com:office:office" xmlns:oel="http://schemas.microsoft.com/office/2019/extlst" xmlns:r="http://schemas.openxmlformats.org/officeDocument/2006/relationships" xmlns:m="http://schemas.openxmlformats.org/officeDocument/2006/math" xmlns:v="urn:schemas-microsoft-com:vml" xmlns:wp14="http://schemas.microsoft.com/office/word/2010/wordprocessingDrawing" xmlns:wp="http://schemas.openxmlformats.org/drawingml/2006/wordprocessingDrawing" xmlns:w10="urn:schemas-microsoft-com:office:word" xmlns:w="http://schemas.openxmlformats.org/wordprocessingml/2006/main" xmlns:w14="http://schemas.microsoft.com/office/word/2010/wordml" xmlns:w15="http://schemas.microsoft.com/office/word/2012/wordml" xmlns:w16cex="http://schemas.microsoft.com/office/word/2018/wordml/cex" xmlns:w16cid="http://schemas.microsoft.com/office/word/2016/wordml/cid" xmlns:w16="http://schemas.microsoft.com/office/word/2018/wordml" xmlns:w16sdtdh="http://schemas.microsoft.com/office/word/2020/wordml/sdtdatahash" xmlns:w16se="http://schemas.microsoft.com/office/word/2015/wordml/symex" xmlns:wpg="http://schemas.microsoft.com/office/word/2010/wordprocessingGroup" xmlns:wpi="http://schemas.microsoft.com/office/word/2010/wordprocessingInk" xmlns:wne="http://schemas.microsoft.com/office/word/2006/wordml" xmlns:wps="http://schemas.microsoft.com/office/word/2010/wordprocessingShape" mc:Ignorable="w14 w15 w16se w16cid w16 w16cex w16sdtdh wp14">
   <w15:person w15:author="Amy Kim">
     <w15:presenceInfo w15:providerId="Windows Live" w15:userId="ae5b3ab3c5176d67"/>
+  </w15:person>
+  <w15:person w15:author="Tsao, Carolyn (ELC)">
+    <w15:presenceInfo w15:providerId="AD" w15:userId="S::carolyn.tsao@ky.gov::49a45722-5b9b-4c75-80cd-8dd2e5c11ff9"/>
   </w15:person>
 </w15:people>
 </file>
@@ -26679,6 +27809,78 @@
       <w:color w:val="000000"/>
     </w:rPr>
   </w:style>
+  <w:style w:type="character" w:styleId="CommentReference">
+    <w:name w:val="annotation reference"/>
+    <w:basedOn w:val="DefaultParagraphFont"/>
+    <w:uiPriority w:val="99"/>
+    <w:semiHidden/>
+    <w:unhideWhenUsed/>
+    <w:rsid w:val="00B61ED3"/>
+    <w:rPr>
+      <w:sz w:val="16"/>
+      <w:szCs w:val="16"/>
+    </w:rPr>
+  </w:style>
+  <w:style w:type="paragraph" w:styleId="CommentText">
+    <w:name w:val="annotation text"/>
+    <w:basedOn w:val="Normal"/>
+    <w:link w:val="CommentTextChar"/>
+    <w:uiPriority w:val="99"/>
+    <w:semiHidden/>
+    <w:unhideWhenUsed/>
+    <w:rsid w:val="00B61ED3"/>
+    <w:pPr>
+      <w:spacing w:line="240" w:lineRule="auto"/>
+    </w:pPr>
+    <w:rPr>
+      <w:sz w:val="20"/>
+      <w:szCs w:val="20"/>
+    </w:rPr>
+  </w:style>
+  <w:style w:type="character" w:customStyle="1" w:styleId="CommentTextChar">
+    <w:name w:val="Comment Text Char"/>
+    <w:basedOn w:val="DefaultParagraphFont"/>
+    <w:link w:val="CommentText"/>
+    <w:uiPriority w:val="99"/>
+    <w:semiHidden/>
+    <w:rsid w:val="00B61ED3"/>
+    <w:rPr>
+      <w:rFonts w:ascii="Cambria" w:eastAsia="Cambria" w:hAnsi="Cambria" w:cs="Cambria"/>
+      <w:color w:val="000000"/>
+      <w:sz w:val="20"/>
+      <w:szCs w:val="20"/>
+    </w:rPr>
+  </w:style>
+  <w:style w:type="paragraph" w:styleId="CommentSubject">
+    <w:name w:val="annotation subject"/>
+    <w:basedOn w:val="CommentText"/>
+    <w:next w:val="CommentText"/>
+    <w:link w:val="CommentSubjectChar"/>
+    <w:uiPriority w:val="99"/>
+    <w:semiHidden/>
+    <w:unhideWhenUsed/>
+    <w:rsid w:val="00B61ED3"/>
+    <w:rPr>
+      <w:b/>
+      <w:bCs/>
+    </w:rPr>
+  </w:style>
+  <w:style w:type="character" w:customStyle="1" w:styleId="CommentSubjectChar">
+    <w:name w:val="Comment Subject Char"/>
+    <w:basedOn w:val="CommentTextChar"/>
+    <w:link w:val="CommentSubject"/>
+    <w:uiPriority w:val="99"/>
+    <w:semiHidden/>
+    <w:rsid w:val="00B61ED3"/>
+    <w:rPr>
+      <w:rFonts w:ascii="Cambria" w:eastAsia="Cambria" w:hAnsi="Cambria" w:cs="Cambria"/>
+      <w:b/>
+      <w:bCs/>
+      <w:color w:val="000000"/>
+      <w:sz w:val="20"/>
+      <w:szCs w:val="20"/>
+    </w:rPr>
+  </w:style>
 </w:styles>
 </file>
 

</xml_diff>